<commit_message>
docs: cập nhật tài liệu sau Sprint 3
- README: trạng thái Sprint 3, tính năng, cấu trúc thư mục, bảng endpoint, kết quả 152 test, hướng dẫn kiểm tra nhanh
- sequence_diagram.md: viết lại theo API thực tế đến hết Sprint 3
- Danh sách chức năng: 48/49 hoàn thành (còn FR-27, Mở rộng)
- User Story: 50/51 hoàn thành (còn US-24, Mở rộng)
- RouteAPI v1.1: thêm mục 9 liệt kê API JSON đã triển khai

Co-Authored-By: Claude Sonnet 5.5 <noreply@anthropic.com>
Claude-Session: https://claude.ai/code/session_01QUC6HUnL43YxjV2v3TcRX9
</commit_message>
<xml_diff>
--- a/docs/RouteAPI_QuickOrder_v1.0.docx
+++ b/docs/RouteAPI_QuickOrder_v1.0.docx
@@ -115,7 +115,7 @@
           <w:sz w:val="26"/>
           <w:szCs w:val="26"/>
         </w:rPr>
-        <w:t xml:space="preserve">Phiên bản 1.0 – Sau Sprint 1</w:t>
+        <w:t>Phiên bản 1.1 – Sau Sprint 3</w:t>
       </w:r>
     </w:p>
     <w:tbl>
@@ -334,7 +334,7 @@
                 <w:sz w:val="24"/>
                 <w:szCs w:val="24"/>
               </w:rPr>
-              <w:t xml:space="preserve">21/10/2026</w:t>
+              <w:t>30/10/2026</w:t>
             </w:r>
           </w:p>
         </w:tc>
@@ -425,6 +425,7 @@
     <w:p>
       <w:pPr>
         <w:sectPr>
+          <w:footerReference w:type="default" r:id="rId10"/>
           <w:pgSz w:w="11906" w:h="16838" w:orient="portrait"/>
           <w:pgMar w:top="1134" w:right="1134" w:bottom="1134" w:left="1701" w:header="708" w:footer="708" w:gutter="0"/>
           <w:pgNumType/>
@@ -879,6 +880,139 @@
                 <w:szCs w:val="22"/>
               </w:rPr>
               <w:t xml:space="preserve">Rà soát sau Sprint 1: thống nhất đường dẫn với Sequence Diagram v1.0 và SRS v1.0; giữ nguyên 82 route (route Sprint 1 đã triển khai).</w:t>
+            </w:r>
+          </w:p>
+        </w:tc>
+      </w:tr>
+      <w:tr>
+        <w:trPr>
+          <w:cantSplit/>
+        </w:trPr>
+        <w:tc>
+          <w:tcPr>
+            <w:tcW w:type="dxa" w:w="1100"/>
+            <w:tcBorders>
+              <w:top w:val="single" w:color="A6A6A6" w:sz="4"/>
+              <w:left w:val="single" w:color="A6A6A6" w:sz="4"/>
+              <w:bottom w:val="single" w:color="A6A6A6" w:sz="4"/>
+              <w:right w:val="single" w:color="A6A6A6" w:sz="4"/>
+            </w:tcBorders>
+            <w:tcMar>
+              <w:top w:type="dxa" w:w="60"/>
+              <w:left w:type="dxa" w:w="90"/>
+              <w:bottom w:type="dxa" w:w="40"/>
+              <w:right w:type="dxa" w:w="90"/>
+            </w:tcMar>
+            <w:vAlign w:val="top"/>
+          </w:tcPr>
+          <w:p>
+            <w:pPr>
+              <w:spacing w:after="30"/>
+              <w:jc w:val="center"/>
+            </w:pPr>
+            <w:r>
+              <w:rPr>
+                <w:rFonts w:ascii="Times New Roman" w:cs="Times New Roman" w:eastAsia="Times New Roman" w:hAnsi="Times New Roman"/>
+                <w:sz w:val="22"/>
+                <w:szCs w:val="22"/>
+              </w:rPr>
+              <w:t>1.1</w:t>
+            </w:r>
+          </w:p>
+        </w:tc>
+        <w:tc>
+          <w:tcPr>
+            <w:tcW w:type="dxa" w:w="1500"/>
+            <w:tcBorders>
+              <w:top w:val="single" w:color="A6A6A6" w:sz="4"/>
+              <w:left w:val="single" w:color="A6A6A6" w:sz="4"/>
+              <w:bottom w:val="single" w:color="A6A6A6" w:sz="4"/>
+              <w:right w:val="single" w:color="A6A6A6" w:sz="4"/>
+            </w:tcBorders>
+            <w:tcMar>
+              <w:top w:type="dxa" w:w="60"/>
+              <w:left w:type="dxa" w:w="90"/>
+              <w:bottom w:type="dxa" w:w="40"/>
+              <w:right w:type="dxa" w:w="90"/>
+            </w:tcMar>
+            <w:vAlign w:val="top"/>
+          </w:tcPr>
+          <w:p>
+            <w:pPr>
+              <w:spacing w:after="30"/>
+              <w:jc w:val="center"/>
+            </w:pPr>
+            <w:r>
+              <w:rPr>
+                <w:rFonts w:ascii="Times New Roman" w:cs="Times New Roman" w:eastAsia="Times New Roman" w:hAnsi="Times New Roman"/>
+                <w:sz w:val="22"/>
+                <w:szCs w:val="22"/>
+              </w:rPr>
+              <w:t>30/10/2026</w:t>
+            </w:r>
+          </w:p>
+        </w:tc>
+        <w:tc>
+          <w:tcPr>
+            <w:tcW w:type="dxa" w:w="2300"/>
+            <w:tcBorders>
+              <w:top w:val="single" w:color="A6A6A6" w:sz="4"/>
+              <w:left w:val="single" w:color="A6A6A6" w:sz="4"/>
+              <w:bottom w:val="single" w:color="A6A6A6" w:sz="4"/>
+              <w:right w:val="single" w:color="A6A6A6" w:sz="4"/>
+            </w:tcBorders>
+            <w:tcMar>
+              <w:top w:type="dxa" w:w="60"/>
+              <w:left w:type="dxa" w:w="90"/>
+              <w:bottom w:type="dxa" w:w="40"/>
+              <w:right w:type="dxa" w:w="90"/>
+            </w:tcMar>
+            <w:vAlign w:val="top"/>
+          </w:tcPr>
+          <w:p>
+            <w:pPr>
+              <w:spacing w:after="30"/>
+              <w:jc w:val="left"/>
+            </w:pPr>
+            <w:r>
+              <w:rPr>
+                <w:rFonts w:ascii="Times New Roman" w:cs="Times New Roman" w:eastAsia="Times New Roman" w:hAnsi="Times New Roman"/>
+                <w:sz w:val="22"/>
+                <w:szCs w:val="22"/>
+              </w:rPr>
+              <w:t>Nguyễn Xuân Anh</w:t>
+            </w:r>
+          </w:p>
+        </w:tc>
+        <w:tc>
+          <w:tcPr>
+            <w:tcW w:type="dxa" w:w="4171"/>
+            <w:tcBorders>
+              <w:top w:val="single" w:color="A6A6A6" w:sz="4"/>
+              <w:left w:val="single" w:color="A6A6A6" w:sz="4"/>
+              <w:bottom w:val="single" w:color="A6A6A6" w:sz="4"/>
+              <w:right w:val="single" w:color="A6A6A6" w:sz="4"/>
+            </w:tcBorders>
+            <w:tcMar>
+              <w:top w:type="dxa" w:w="60"/>
+              <w:left w:type="dxa" w:w="90"/>
+              <w:bottom w:type="dxa" w:w="40"/>
+              <w:right w:type="dxa" w:w="90"/>
+            </w:tcMar>
+            <w:vAlign w:val="top"/>
+          </w:tcPr>
+          <w:p>
+            <w:pPr>
+              <w:spacing w:after="30"/>
+              <w:jc w:val="left"/>
+            </w:pPr>
+            <w:r>
+              <w:rPr>
+                <w:rFonts w:ascii="Times New Roman" w:cs="Times New Roman" w:eastAsia="Times New Roman" w:hAnsi="Times New Roman"/>
+                <w:sz w:val="22"/>
+                <w:szCs w:val="22"/>
+              </w:rPr>
+              <w:t>Cập nhật sau Sprint 3: thêm mục 9 liệt kê các API JSON đã triển khai thực tế (trang HTML tĩnh gọi API dưới /api). Mục 1 đến 8 giữ làm thiết kế ban đầu.</w:t>
             </w:r>
           </w:p>
         </w:tc>
@@ -48531,6 +48665,2222 @@
         <w:t xml:space="preserve">Khi đổi route, cập nhật tài liệu này và ghi vào lịch sử thay đổi để các thành viên cùng biết.</w:t>
       </w:r>
     </w:p>
+    <w:p>
+      <w:pPr>
+        <w:pStyle w:val="Heading1"/>
+      </w:pPr>
+      <w:r>
+        <w:rPr>
+          <w:rFonts w:ascii="Times New Roman" w:cs="Times New Roman" w:eastAsia="Times New Roman" w:hAnsi="Times New Roman"/>
+        </w:rPr>
+        <w:t>9. API JSON đã triển khai (cập nhật sau Sprint 3)</w:t>
+      </w:r>
+    </w:p>
+    <w:p>
+      <w:pPr>
+        <w:pStyle w:val="Heading2"/>
+      </w:pPr>
+      <w:r>
+        <w:rPr>
+          <w:rFonts w:ascii="Times New Roman" w:cs="Times New Roman" w:eastAsia="Times New Roman" w:hAnsi="Times New Roman"/>
+        </w:rPr>
+        <w:t>9.1. Kiến trúc thực tế</w:t>
+      </w:r>
+    </w:p>
+    <w:p>
+      <w:pPr>
+        <w:spacing w:after="120" w:before="0" w:line="300"/>
+        <w:jc w:val="both"/>
+      </w:pPr>
+      <w:r>
+        <w:rPr>
+          <w:rFonts w:ascii="Times New Roman" w:cs="Times New Roman" w:eastAsia="Times New Roman" w:hAnsi="Times New Roman"/>
+          <w:sz w:val="26"/>
+          <w:szCs w:val="26"/>
+        </w:rPr>
+        <w:t>Bản cài đặt khác thiết kế ban đầu ở mục 1 đến 8: giao diện là các trang HTML tĩnh (thư mục customer/, merchant/, admin/) gọi API JSON dưới tiền tố /api bằng fetch (hàm QO.api trong js/app.js); không dùng Jinja2, không dùng route /t/&lt;token&gt;. Mã nguồn chia ba tệp: app.py, admin_api.py, complaint_api.py. Mục này là danh sách API thực tế để đối chiếu; khi thiết kế và cài đặt khác nhau, lấy mục 9 làm chuẩn.</w:t>
+      </w:r>
+    </w:p>
+    <w:p>
+      <w:pPr>
+        <w:pStyle w:val="ListParagraph"/>
+        <w:numPr>
+          <w:ilvl w:val="0"/>
+          <w:numId w:val="2"/>
+        </w:numPr>
+        <w:spacing w:after="80" w:line="288"/>
+        <w:jc w:val="left"/>
+      </w:pPr>
+      <w:r>
+        <w:rPr>
+          <w:rFonts w:ascii="Times New Roman" w:cs="Times New Roman" w:eastAsia="Times New Roman" w:hAnsi="Times New Roman"/>
+          <w:sz w:val="26"/>
+          <w:szCs w:val="26"/>
+        </w:rPr>
+        <w:t>Phiên đăng nhập lưu phía server (cookie đã ký). Quyền kiểm tra ở server cho từng API: chủ quán chỉ thao tác trên quán của mình, quản trị viên có API riêng dưới /api/admin.</w:t>
+      </w:r>
+    </w:p>
+    <w:p>
+      <w:pPr>
+        <w:pStyle w:val="ListParagraph"/>
+        <w:numPr>
+          <w:ilvl w:val="0"/>
+          <w:numId w:val="2"/>
+        </w:numPr>
+        <w:spacing w:after="80" w:line="288"/>
+        <w:jc w:val="left"/>
+      </w:pPr>
+      <w:r>
+        <w:rPr>
+          <w:rFonts w:ascii="Times New Roman" w:cs="Times New Roman" w:eastAsia="Times New Roman" w:hAnsi="Times New Roman"/>
+          <w:sz w:val="26"/>
+          <w:szCs w:val="26"/>
+        </w:rPr>
+        <w:t>Khách ẩn danh dùng mã riêng của đơn (access_token): trả về một lần khi gửi đơn, server chỉ lưu bản băm. Mã này dùng để xem, hủy, đánh giá và khiếu nại đơn của mình.</w:t>
+      </w:r>
+    </w:p>
+    <w:p>
+      <w:pPr>
+        <w:pStyle w:val="ListParagraph"/>
+        <w:numPr>
+          <w:ilvl w:val="0"/>
+          <w:numId w:val="2"/>
+        </w:numPr>
+        <w:spacing w:after="80" w:line="288"/>
+        <w:jc w:val="left"/>
+      </w:pPr>
+      <w:r>
+        <w:rPr>
+          <w:rFonts w:ascii="Times New Roman" w:cs="Times New Roman" w:eastAsia="Times New Roman" w:hAnsi="Times New Roman"/>
+          <w:sz w:val="26"/>
+          <w:szCs w:val="26"/>
+        </w:rPr>
+        <w:t>Giá luôn tính ở server: khách chỉ gửi dish_id, quantity, option_ids; POST /api/orders/quote tính tạm trước khi gửi đơn.</w:t>
+      </w:r>
+    </w:p>
+    <w:p>
+      <w:pPr>
+        <w:pStyle w:val="ListParagraph"/>
+        <w:numPr>
+          <w:ilvl w:val="0"/>
+          <w:numId w:val="2"/>
+        </w:numPr>
+        <w:spacing w:after="80" w:line="288"/>
+        <w:jc w:val="left"/>
+      </w:pPr>
+      <w:r>
+        <w:rPr>
+          <w:rFonts w:ascii="Times New Roman" w:cs="Times New Roman" w:eastAsia="Times New Roman" w:hAnsi="Times New Roman"/>
+          <w:sz w:val="26"/>
+          <w:szCs w:val="26"/>
+        </w:rPr>
+        <w:t>Trạng thái đơn: PENDING, PREPARING, COMPLETED, CANCELLED. Thanh toán (chưa trả, đã trả) tách riêng.</w:t>
+      </w:r>
+    </w:p>
+    <w:p>
+      <w:pPr>
+        <w:pStyle w:val="Heading2"/>
+      </w:pPr>
+      <w:r>
+        <w:rPr>
+          <w:rFonts w:ascii="Times New Roman" w:cs="Times New Roman" w:eastAsia="Times New Roman" w:hAnsi="Times New Roman"/>
+        </w:rPr>
+        <w:t>9.2. Danh sách endpoint</w:t>
+      </w:r>
+    </w:p>
+    <w:tbl>
+      <w:tblPr>
+        <w:tblW w:type="dxa" w:w="9071"/>
+        <w:tblBorders>
+          <w:top w:val="single" w:color="auto" w:sz="4"/>
+          <w:left w:val="single" w:color="auto" w:sz="4"/>
+          <w:bottom w:val="single" w:color="auto" w:sz="4"/>
+          <w:right w:val="single" w:color="auto" w:sz="4"/>
+          <w:insideH w:val="single" w:color="auto" w:sz="4"/>
+          <w:insideV w:val="single" w:color="auto" w:sz="4"/>
+        </w:tblBorders>
+      </w:tblPr>
+      <w:tblGrid>
+        <w:gridCol w:w="1500"/>
+        <w:gridCol w:w="3000"/>
+        <w:gridCol w:w="1500"/>
+        <w:gridCol w:w="3071"/>
+      </w:tblGrid>
+      <w:tr>
+        <w:trPr>
+          <w:cantSplit/>
+          <w:tblHeader/>
+        </w:trPr>
+        <w:tc>
+          <w:tcPr>
+            <w:tcW w:type="dxa" w:w="1500"/>
+            <w:tcBorders>
+              <w:top w:val="single" w:color="A6A6A6" w:sz="4"/>
+              <w:left w:val="single" w:color="A6A6A6" w:sz="4"/>
+              <w:bottom w:val="single" w:color="A6A6A6" w:sz="4"/>
+              <w:right w:val="single" w:color="A6A6A6" w:sz="4"/>
+            </w:tcBorders>
+            <w:shd w:fill="1F4E79" w:color="auto" w:val="clear"/>
+            <w:tcMar>
+              <w:top w:type="dxa" w:w="60"/>
+              <w:left w:type="dxa" w:w="90"/>
+              <w:bottom w:type="dxa" w:w="40"/>
+              <w:right w:type="dxa" w:w="90"/>
+            </w:tcMar>
+            <w:vAlign w:val="top"/>
+          </w:tcPr>
+          <w:p>
+            <w:pPr>
+              <w:spacing w:after="30"/>
+              <w:jc w:val="center"/>
+            </w:pPr>
+            <w:r>
+              <w:rPr>
+                <w:rFonts w:ascii="Times New Roman" w:cs="Times New Roman" w:eastAsia="Times New Roman" w:hAnsi="Times New Roman"/>
+                <w:b/>
+                <w:bCs/>
+                <w:color w:val="FFFFFF"/>
+                <w:sz w:val="22"/>
+                <w:szCs w:val="22"/>
+              </w:rPr>
+              <w:t xml:space="preserve">Nhóm</w:t>
+            </w:r>
+          </w:p>
+        </w:tc>
+        <w:tc>
+          <w:tcPr>
+            <w:tcW w:type="dxa" w:w="3000"/>
+            <w:tcBorders>
+              <w:top w:val="single" w:color="A6A6A6" w:sz="4"/>
+              <w:left w:val="single" w:color="A6A6A6" w:sz="4"/>
+              <w:bottom w:val="single" w:color="A6A6A6" w:sz="4"/>
+              <w:right w:val="single" w:color="A6A6A6" w:sz="4"/>
+            </w:tcBorders>
+            <w:shd w:fill="1F4E79" w:color="auto" w:val="clear"/>
+            <w:tcMar>
+              <w:top w:type="dxa" w:w="60"/>
+              <w:left w:type="dxa" w:w="90"/>
+              <w:bottom w:type="dxa" w:w="40"/>
+              <w:right w:type="dxa" w:w="90"/>
+            </w:tcMar>
+            <w:vAlign w:val="top"/>
+          </w:tcPr>
+          <w:p>
+            <w:pPr>
+              <w:spacing w:after="30"/>
+              <w:jc w:val="center"/>
+            </w:pPr>
+            <w:r>
+              <w:rPr>
+                <w:rFonts w:ascii="Times New Roman" w:cs="Times New Roman" w:eastAsia="Times New Roman" w:hAnsi="Times New Roman"/>
+                <w:b/>
+                <w:bCs/>
+                <w:color w:val="FFFFFF"/>
+                <w:sz w:val="22"/>
+                <w:szCs w:val="22"/>
+              </w:rPr>
+              <w:t xml:space="preserve">Method và URL</w:t>
+            </w:r>
+          </w:p>
+        </w:tc>
+        <w:tc>
+          <w:tcPr>
+            <w:tcW w:type="dxa" w:w="1500"/>
+            <w:tcBorders>
+              <w:top w:val="single" w:color="A6A6A6" w:sz="4"/>
+              <w:left w:val="single" w:color="A6A6A6" w:sz="4"/>
+              <w:bottom w:val="single" w:color="A6A6A6" w:sz="4"/>
+              <w:right w:val="single" w:color="A6A6A6" w:sz="4"/>
+            </w:tcBorders>
+            <w:shd w:fill="1F4E79" w:color="auto" w:val="clear"/>
+            <w:tcMar>
+              <w:top w:type="dxa" w:w="60"/>
+              <w:left w:type="dxa" w:w="90"/>
+              <w:bottom w:type="dxa" w:w="40"/>
+              <w:right w:type="dxa" w:w="90"/>
+            </w:tcMar>
+            <w:vAlign w:val="top"/>
+          </w:tcPr>
+          <w:p>
+            <w:pPr>
+              <w:spacing w:after="30"/>
+              <w:jc w:val="center"/>
+            </w:pPr>
+            <w:r>
+              <w:rPr>
+                <w:rFonts w:ascii="Times New Roman" w:cs="Times New Roman" w:eastAsia="Times New Roman" w:hAnsi="Times New Roman"/>
+                <w:b/>
+                <w:bCs/>
+                <w:color w:val="FFFFFF"/>
+                <w:sz w:val="22"/>
+                <w:szCs w:val="22"/>
+              </w:rPr>
+              <w:t xml:space="preserve">Quyền</w:t>
+            </w:r>
+          </w:p>
+        </w:tc>
+        <w:tc>
+          <w:tcPr>
+            <w:tcW w:type="dxa" w:w="3071"/>
+            <w:tcBorders>
+              <w:top w:val="single" w:color="A6A6A6" w:sz="4"/>
+              <w:left w:val="single" w:color="A6A6A6" w:sz="4"/>
+              <w:bottom w:val="single" w:color="A6A6A6" w:sz="4"/>
+              <w:right w:val="single" w:color="A6A6A6" w:sz="4"/>
+            </w:tcBorders>
+            <w:shd w:fill="1F4E79" w:color="auto" w:val="clear"/>
+            <w:tcMar>
+              <w:top w:type="dxa" w:w="60"/>
+              <w:left w:type="dxa" w:w="90"/>
+              <w:bottom w:type="dxa" w:w="40"/>
+              <w:right w:type="dxa" w:w="90"/>
+            </w:tcMar>
+            <w:vAlign w:val="top"/>
+          </w:tcPr>
+          <w:p>
+            <w:pPr>
+              <w:spacing w:after="30"/>
+              <w:jc w:val="center"/>
+            </w:pPr>
+            <w:r>
+              <w:rPr>
+                <w:rFonts w:ascii="Times New Roman" w:cs="Times New Roman" w:eastAsia="Times New Roman" w:hAnsi="Times New Roman"/>
+                <w:b/>
+                <w:bCs/>
+                <w:color w:val="FFFFFF"/>
+                <w:sz w:val="22"/>
+                <w:szCs w:val="22"/>
+              </w:rPr>
+              <w:t xml:space="preserve">Mô tả</w:t>
+            </w:r>
+          </w:p>
+        </w:tc>
+      </w:tr>
+      <w:tr>
+        <w:trPr>
+          <w:cantSplit/>
+        </w:trPr>
+        <w:tc>
+          <w:tcPr>
+            <w:tcW w:type="dxa" w:w="1500"/>
+            <w:tcBorders>
+              <w:top w:val="single" w:color="A6A6A6" w:sz="4"/>
+              <w:left w:val="single" w:color="A6A6A6" w:sz="4"/>
+              <w:bottom w:val="single" w:color="A6A6A6" w:sz="4"/>
+              <w:right w:val="single" w:color="A6A6A6" w:sz="4"/>
+            </w:tcBorders>
+            <w:tcMar>
+              <w:top w:type="dxa" w:w="60"/>
+              <w:left w:type="dxa" w:w="90"/>
+              <w:bottom w:type="dxa" w:w="40"/>
+              <w:right w:type="dxa" w:w="90"/>
+            </w:tcMar>
+            <w:vAlign w:val="top"/>
+          </w:tcPr>
+          <w:p>
+            <w:pPr>
+              <w:spacing w:after="30"/>
+              <w:jc w:val="left"/>
+            </w:pPr>
+            <w:r>
+              <w:rPr>
+                <w:rFonts w:ascii="Times New Roman" w:cs="Times New Roman" w:eastAsia="Times New Roman" w:hAnsi="Times New Roman"/>
+                <w:sz w:val="22"/>
+                <w:szCs w:val="22"/>
+              </w:rPr>
+              <w:t xml:space="preserve">Tài khoản</w:t>
+            </w:r>
+          </w:p>
+        </w:tc>
+        <w:tc>
+          <w:tcPr>
+            <w:tcW w:type="dxa" w:w="3000"/>
+            <w:tcBorders>
+              <w:top w:val="single" w:color="A6A6A6" w:sz="4"/>
+              <w:left w:val="single" w:color="A6A6A6" w:sz="4"/>
+              <w:bottom w:val="single" w:color="A6A6A6" w:sz="4"/>
+              <w:right w:val="single" w:color="A6A6A6" w:sz="4"/>
+            </w:tcBorders>
+            <w:tcMar>
+              <w:top w:type="dxa" w:w="60"/>
+              <w:left w:type="dxa" w:w="90"/>
+              <w:bottom w:type="dxa" w:w="40"/>
+              <w:right w:type="dxa" w:w="90"/>
+            </w:tcMar>
+            <w:vAlign w:val="top"/>
+          </w:tcPr>
+          <w:p>
+            <w:pPr>
+              <w:spacing w:after="30"/>
+              <w:jc w:val="left"/>
+            </w:pPr>
+            <w:r>
+              <w:rPr>
+                <w:rFonts w:ascii="Times New Roman" w:cs="Times New Roman" w:eastAsia="Times New Roman" w:hAnsi="Times New Roman"/>
+                <w:sz w:val="22"/>
+                <w:szCs w:val="22"/>
+              </w:rPr>
+              <w:t xml:space="preserve">POST /api/register; POST /api/login; POST /api/logout; GET, PUT /api/me</w:t>
+            </w:r>
+          </w:p>
+        </w:tc>
+        <w:tc>
+          <w:tcPr>
+            <w:tcW w:type="dxa" w:w="1500"/>
+            <w:tcBorders>
+              <w:top w:val="single" w:color="A6A6A6" w:sz="4"/>
+              <w:left w:val="single" w:color="A6A6A6" w:sz="4"/>
+              <w:bottom w:val="single" w:color="A6A6A6" w:sz="4"/>
+              <w:right w:val="single" w:color="A6A6A6" w:sz="4"/>
+            </w:tcBorders>
+            <w:tcMar>
+              <w:top w:type="dxa" w:w="60"/>
+              <w:left w:type="dxa" w:w="90"/>
+              <w:bottom w:type="dxa" w:w="40"/>
+              <w:right w:type="dxa" w:w="90"/>
+            </w:tcMar>
+            <w:vAlign w:val="top"/>
+          </w:tcPr>
+          <w:p>
+            <w:pPr>
+              <w:spacing w:after="30"/>
+              <w:jc w:val="left"/>
+            </w:pPr>
+            <w:r>
+              <w:rPr>
+                <w:rFonts w:ascii="Times New Roman" w:cs="Times New Roman" w:eastAsia="Times New Roman" w:hAnsi="Times New Roman"/>
+                <w:sz w:val="22"/>
+                <w:szCs w:val="22"/>
+              </w:rPr>
+              <w:t xml:space="preserve">Mọi vai trò</w:t>
+            </w:r>
+          </w:p>
+        </w:tc>
+        <w:tc>
+          <w:tcPr>
+            <w:tcW w:type="dxa" w:w="3071"/>
+            <w:tcBorders>
+              <w:top w:val="single" w:color="A6A6A6" w:sz="4"/>
+              <w:left w:val="single" w:color="A6A6A6" w:sz="4"/>
+              <w:bottom w:val="single" w:color="A6A6A6" w:sz="4"/>
+              <w:right w:val="single" w:color="A6A6A6" w:sz="4"/>
+            </w:tcBorders>
+            <w:tcMar>
+              <w:top w:type="dxa" w:w="60"/>
+              <w:left w:type="dxa" w:w="90"/>
+              <w:bottom w:type="dxa" w:w="40"/>
+              <w:right w:type="dxa" w:w="90"/>
+            </w:tcMar>
+            <w:vAlign w:val="top"/>
+          </w:tcPr>
+          <w:p>
+            <w:pPr>
+              <w:spacing w:after="30"/>
+              <w:jc w:val="left"/>
+            </w:pPr>
+            <w:r>
+              <w:rPr>
+                <w:rFonts w:ascii="Times New Roman" w:cs="Times New Roman" w:eastAsia="Times New Roman" w:hAnsi="Times New Roman"/>
+                <w:sz w:val="22"/>
+                <w:szCs w:val="22"/>
+              </w:rPr>
+              <w:t xml:space="preserve">Đăng ký, đăng nhập, đăng xuất, xem và sửa hồ sơ. Tài khoản bị khóa không đăng nhập được.</w:t>
+            </w:r>
+          </w:p>
+        </w:tc>
+      </w:tr>
+      <w:tr>
+        <w:trPr>
+          <w:cantSplit/>
+        </w:trPr>
+        <w:tc>
+          <w:tcPr>
+            <w:tcW w:type="dxa" w:w="1500"/>
+            <w:tcBorders>
+              <w:top w:val="single" w:color="A6A6A6" w:sz="4"/>
+              <w:left w:val="single" w:color="A6A6A6" w:sz="4"/>
+              <w:bottom w:val="single" w:color="A6A6A6" w:sz="4"/>
+              <w:right w:val="single" w:color="A6A6A6" w:sz="4"/>
+            </w:tcBorders>
+            <w:tcMar>
+              <w:top w:type="dxa" w:w="60"/>
+              <w:left w:type="dxa" w:w="90"/>
+              <w:bottom w:type="dxa" w:w="40"/>
+              <w:right w:type="dxa" w:w="90"/>
+            </w:tcMar>
+            <w:vAlign w:val="top"/>
+          </w:tcPr>
+          <w:p>
+            <w:pPr>
+              <w:spacing w:after="30"/>
+              <w:jc w:val="left"/>
+            </w:pPr>
+            <w:r>
+              <w:rPr>
+                <w:rFonts w:ascii="Times New Roman" w:cs="Times New Roman" w:eastAsia="Times New Roman" w:hAnsi="Times New Roman"/>
+                <w:sz w:val="22"/>
+                <w:szCs w:val="22"/>
+              </w:rPr>
+              <w:t xml:space="preserve">Khách đăng ký</w:t>
+            </w:r>
+          </w:p>
+        </w:tc>
+        <w:tc>
+          <w:tcPr>
+            <w:tcW w:type="dxa" w:w="3000"/>
+            <w:tcBorders>
+              <w:top w:val="single" w:color="A6A6A6" w:sz="4"/>
+              <w:left w:val="single" w:color="A6A6A6" w:sz="4"/>
+              <w:bottom w:val="single" w:color="A6A6A6" w:sz="4"/>
+              <w:right w:val="single" w:color="A6A6A6" w:sz="4"/>
+            </w:tcBorders>
+            <w:tcMar>
+              <w:top w:type="dxa" w:w="60"/>
+              <w:left w:type="dxa" w:w="90"/>
+              <w:bottom w:type="dxa" w:w="40"/>
+              <w:right w:type="dxa" w:w="90"/>
+            </w:tcMar>
+            <w:vAlign w:val="top"/>
+          </w:tcPr>
+          <w:p>
+            <w:pPr>
+              <w:spacing w:after="30"/>
+              <w:jc w:val="left"/>
+            </w:pPr>
+            <w:r>
+              <w:rPr>
+                <w:rFonts w:ascii="Times New Roman" w:cs="Times New Roman" w:eastAsia="Times New Roman" w:hAnsi="Times New Roman"/>
+                <w:sz w:val="22"/>
+                <w:szCs w:val="22"/>
+              </w:rPr>
+              <w:t xml:space="preserve">POST /api/customer/signup; /api/customer/resend; /api/customer/verify</w:t>
+            </w:r>
+          </w:p>
+        </w:tc>
+        <w:tc>
+          <w:tcPr>
+            <w:tcW w:type="dxa" w:w="1500"/>
+            <w:tcBorders>
+              <w:top w:val="single" w:color="A6A6A6" w:sz="4"/>
+              <w:left w:val="single" w:color="A6A6A6" w:sz="4"/>
+              <w:bottom w:val="single" w:color="A6A6A6" w:sz="4"/>
+              <w:right w:val="single" w:color="A6A6A6" w:sz="4"/>
+            </w:tcBorders>
+            <w:tcMar>
+              <w:top w:type="dxa" w:w="60"/>
+              <w:left w:type="dxa" w:w="90"/>
+              <w:bottom w:type="dxa" w:w="40"/>
+              <w:right w:type="dxa" w:w="90"/>
+            </w:tcMar>
+            <w:vAlign w:val="top"/>
+          </w:tcPr>
+          <w:p>
+            <w:pPr>
+              <w:spacing w:after="30"/>
+              <w:jc w:val="left"/>
+            </w:pPr>
+            <w:r>
+              <w:rPr>
+                <w:rFonts w:ascii="Times New Roman" w:cs="Times New Roman" w:eastAsia="Times New Roman" w:hAnsi="Times New Roman"/>
+                <w:sz w:val="22"/>
+                <w:szCs w:val="22"/>
+              </w:rPr>
+              <w:t xml:space="preserve">Khách</w:t>
+            </w:r>
+          </w:p>
+        </w:tc>
+        <w:tc>
+          <w:tcPr>
+            <w:tcW w:type="dxa" w:w="3071"/>
+            <w:tcBorders>
+              <w:top w:val="single" w:color="A6A6A6" w:sz="4"/>
+              <w:left w:val="single" w:color="A6A6A6" w:sz="4"/>
+              <w:bottom w:val="single" w:color="A6A6A6" w:sz="4"/>
+              <w:right w:val="single" w:color="A6A6A6" w:sz="4"/>
+            </w:tcBorders>
+            <w:tcMar>
+              <w:top w:type="dxa" w:w="60"/>
+              <w:left w:type="dxa" w:w="90"/>
+              <w:bottom w:type="dxa" w:w="40"/>
+              <w:right w:type="dxa" w:w="90"/>
+            </w:tcMar>
+            <w:vAlign w:val="top"/>
+          </w:tcPr>
+          <w:p>
+            <w:pPr>
+              <w:spacing w:after="30"/>
+              <w:jc w:val="left"/>
+            </w:pPr>
+            <w:r>
+              <w:rPr>
+                <w:rFonts w:ascii="Times New Roman" w:cs="Times New Roman" w:eastAsia="Times New Roman" w:hAnsi="Times New Roman"/>
+                <w:sz w:val="22"/>
+                <w:szCs w:val="22"/>
+              </w:rPr>
+              <w:t xml:space="preserve">Đăng ký tài khoản khách bằng mã 6 số gửi qua email (Brevo).</w:t>
+            </w:r>
+          </w:p>
+        </w:tc>
+      </w:tr>
+      <w:tr>
+        <w:trPr>
+          <w:cantSplit/>
+        </w:trPr>
+        <w:tc>
+          <w:tcPr>
+            <w:tcW w:type="dxa" w:w="1500"/>
+            <w:tcBorders>
+              <w:top w:val="single" w:color="A6A6A6" w:sz="4"/>
+              <w:left w:val="single" w:color="A6A6A6" w:sz="4"/>
+              <w:bottom w:val="single" w:color="A6A6A6" w:sz="4"/>
+              <w:right w:val="single" w:color="A6A6A6" w:sz="4"/>
+            </w:tcBorders>
+            <w:tcMar>
+              <w:top w:type="dxa" w:w="60"/>
+              <w:left w:type="dxa" w:w="90"/>
+              <w:bottom w:type="dxa" w:w="40"/>
+              <w:right w:type="dxa" w:w="90"/>
+            </w:tcMar>
+            <w:vAlign w:val="top"/>
+          </w:tcPr>
+          <w:p>
+            <w:pPr>
+              <w:spacing w:after="30"/>
+              <w:jc w:val="left"/>
+            </w:pPr>
+            <w:r>
+              <w:rPr>
+                <w:rFonts w:ascii="Times New Roman" w:cs="Times New Roman" w:eastAsia="Times New Roman" w:hAnsi="Times New Roman"/>
+                <w:sz w:val="22"/>
+                <w:szCs w:val="22"/>
+              </w:rPr>
+              <w:t xml:space="preserve">Dữ liệu chung</w:t>
+            </w:r>
+          </w:p>
+        </w:tc>
+        <w:tc>
+          <w:tcPr>
+            <w:tcW w:type="dxa" w:w="3000"/>
+            <w:tcBorders>
+              <w:top w:val="single" w:color="A6A6A6" w:sz="4"/>
+              <w:left w:val="single" w:color="A6A6A6" w:sz="4"/>
+              <w:bottom w:val="single" w:color="A6A6A6" w:sz="4"/>
+              <w:right w:val="single" w:color="A6A6A6" w:sz="4"/>
+            </w:tcBorders>
+            <w:tcMar>
+              <w:top w:type="dxa" w:w="60"/>
+              <w:left w:type="dxa" w:w="90"/>
+              <w:bottom w:type="dxa" w:w="40"/>
+              <w:right w:type="dxa" w:w="90"/>
+            </w:tcMar>
+            <w:vAlign w:val="top"/>
+          </w:tcPr>
+          <w:p>
+            <w:pPr>
+              <w:spacing w:after="30"/>
+              <w:jc w:val="left"/>
+            </w:pPr>
+            <w:r>
+              <w:rPr>
+                <w:rFonts w:ascii="Times New Roman" w:cs="Times New Roman" w:eastAsia="Times New Roman" w:hAnsi="Times New Roman"/>
+                <w:sz w:val="22"/>
+                <w:szCs w:val="22"/>
+              </w:rPr>
+              <w:t xml:space="preserve">GET, POST, PUT, DELETE /api/shops, /api/tables, /api/categories, /api/dishes, /api/optionGroups, /api/options (và /&lt;id&gt;)</w:t>
+            </w:r>
+          </w:p>
+        </w:tc>
+        <w:tc>
+          <w:tcPr>
+            <w:tcW w:type="dxa" w:w="1500"/>
+            <w:tcBorders>
+              <w:top w:val="single" w:color="A6A6A6" w:sz="4"/>
+              <w:left w:val="single" w:color="A6A6A6" w:sz="4"/>
+              <w:bottom w:val="single" w:color="A6A6A6" w:sz="4"/>
+              <w:right w:val="single" w:color="A6A6A6" w:sz="4"/>
+            </w:tcBorders>
+            <w:tcMar>
+              <w:top w:type="dxa" w:w="60"/>
+              <w:left w:type="dxa" w:w="90"/>
+              <w:bottom w:type="dxa" w:w="40"/>
+              <w:right w:type="dxa" w:w="90"/>
+            </w:tcMar>
+            <w:vAlign w:val="top"/>
+          </w:tcPr>
+          <w:p>
+            <w:pPr>
+              <w:spacing w:after="30"/>
+              <w:jc w:val="left"/>
+            </w:pPr>
+            <w:r>
+              <w:rPr>
+                <w:rFonts w:ascii="Times New Roman" w:cs="Times New Roman" w:eastAsia="Times New Roman" w:hAnsi="Times New Roman"/>
+                <w:sz w:val="22"/>
+                <w:szCs w:val="22"/>
+              </w:rPr>
+              <w:t xml:space="preserve">Đọc: mọi người; ghi: chủ quán, admin</w:t>
+            </w:r>
+          </w:p>
+        </w:tc>
+        <w:tc>
+          <w:tcPr>
+            <w:tcW w:type="dxa" w:w="3071"/>
+            <w:tcBorders>
+              <w:top w:val="single" w:color="A6A6A6" w:sz="4"/>
+              <w:left w:val="single" w:color="A6A6A6" w:sz="4"/>
+              <w:bottom w:val="single" w:color="A6A6A6" w:sz="4"/>
+              <w:right w:val="single" w:color="A6A6A6" w:sz="4"/>
+            </w:tcBorders>
+            <w:tcMar>
+              <w:top w:type="dxa" w:w="60"/>
+              <w:left w:type="dxa" w:w="90"/>
+              <w:bottom w:type="dxa" w:w="40"/>
+              <w:right w:type="dxa" w:w="90"/>
+            </w:tcMar>
+            <w:vAlign w:val="top"/>
+          </w:tcPr>
+          <w:p>
+            <w:pPr>
+              <w:spacing w:after="30"/>
+              <w:jc w:val="left"/>
+            </w:pPr>
+            <w:r>
+              <w:rPr>
+                <w:rFonts w:ascii="Times New Roman" w:cs="Times New Roman" w:eastAsia="Times New Roman" w:hAnsi="Times New Roman"/>
+                <w:sz w:val="22"/>
+                <w:szCs w:val="22"/>
+              </w:rPr>
+              <w:t xml:space="preserve">Quản lý quán, bàn, danh mục, món, nhóm tùy chọn, tùy chọn. Chủ quán chỉ ghi được dữ liệu thuộc quán mình. Admin khóa hoặc mở khóa quán qua PUT /api/shops/&lt;id&gt; (trường status).</w:t>
+            </w:r>
+          </w:p>
+        </w:tc>
+      </w:tr>
+      <w:tr>
+        <w:trPr>
+          <w:cantSplit/>
+        </w:trPr>
+        <w:tc>
+          <w:tcPr>
+            <w:tcW w:type="dxa" w:w="1500"/>
+            <w:tcBorders>
+              <w:top w:val="single" w:color="A6A6A6" w:sz="4"/>
+              <w:left w:val="single" w:color="A6A6A6" w:sz="4"/>
+              <w:bottom w:val="single" w:color="A6A6A6" w:sz="4"/>
+              <w:right w:val="single" w:color="A6A6A6" w:sz="4"/>
+            </w:tcBorders>
+            <w:tcMar>
+              <w:top w:type="dxa" w:w="60"/>
+              <w:left w:type="dxa" w:w="90"/>
+              <w:bottom w:type="dxa" w:w="40"/>
+              <w:right w:type="dxa" w:w="90"/>
+            </w:tcMar>
+            <w:vAlign w:val="top"/>
+          </w:tcPr>
+          <w:p>
+            <w:pPr>
+              <w:spacing w:after="30"/>
+              <w:jc w:val="left"/>
+            </w:pPr>
+            <w:r>
+              <w:rPr>
+                <w:rFonts w:ascii="Times New Roman" w:cs="Times New Roman" w:eastAsia="Times New Roman" w:hAnsi="Times New Roman"/>
+                <w:sz w:val="22"/>
+                <w:szCs w:val="22"/>
+              </w:rPr>
+              <w:t xml:space="preserve">QR và thanh toán QR</w:t>
+            </w:r>
+          </w:p>
+        </w:tc>
+        <w:tc>
+          <w:tcPr>
+            <w:tcW w:type="dxa" w:w="3000"/>
+            <w:tcBorders>
+              <w:top w:val="single" w:color="A6A6A6" w:sz="4"/>
+              <w:left w:val="single" w:color="A6A6A6" w:sz="4"/>
+              <w:bottom w:val="single" w:color="A6A6A6" w:sz="4"/>
+              <w:right w:val="single" w:color="A6A6A6" w:sz="4"/>
+            </w:tcBorders>
+            <w:tcMar>
+              <w:top w:type="dxa" w:w="60"/>
+              <w:left w:type="dxa" w:w="90"/>
+              <w:bottom w:type="dxa" w:w="40"/>
+              <w:right w:type="dxa" w:w="90"/>
+            </w:tcMar>
+            <w:vAlign w:val="top"/>
+          </w:tcPr>
+          <w:p>
+            <w:pPr>
+              <w:spacing w:after="30"/>
+              <w:jc w:val="left"/>
+            </w:pPr>
+            <w:r>
+              <w:rPr>
+                <w:rFonts w:ascii="Times New Roman" w:cs="Times New Roman" w:eastAsia="Times New Roman" w:hAnsi="Times New Roman"/>
+                <w:sz w:val="22"/>
+                <w:szCs w:val="22"/>
+              </w:rPr>
+              <w:t xml:space="preserve">GET /api/qr/&lt;token&gt;; POST /api/shops/&lt;id&gt;/qr; GET /uploads/&lt;tên&gt;</w:t>
+            </w:r>
+          </w:p>
+        </w:tc>
+        <w:tc>
+          <w:tcPr>
+            <w:tcW w:type="dxa" w:w="1500"/>
+            <w:tcBorders>
+              <w:top w:val="single" w:color="A6A6A6" w:sz="4"/>
+              <w:left w:val="single" w:color="A6A6A6" w:sz="4"/>
+              <w:bottom w:val="single" w:color="A6A6A6" w:sz="4"/>
+              <w:right w:val="single" w:color="A6A6A6" w:sz="4"/>
+            </w:tcBorders>
+            <w:tcMar>
+              <w:top w:type="dxa" w:w="60"/>
+              <w:left w:type="dxa" w:w="90"/>
+              <w:bottom w:type="dxa" w:w="40"/>
+              <w:right w:type="dxa" w:w="90"/>
+            </w:tcMar>
+            <w:vAlign w:val="top"/>
+          </w:tcPr>
+          <w:p>
+            <w:pPr>
+              <w:spacing w:after="30"/>
+              <w:jc w:val="left"/>
+            </w:pPr>
+            <w:r>
+              <w:rPr>
+                <w:rFonts w:ascii="Times New Roman" w:cs="Times New Roman" w:eastAsia="Times New Roman" w:hAnsi="Times New Roman"/>
+                <w:sz w:val="22"/>
+                <w:szCs w:val="22"/>
+              </w:rPr>
+              <w:t xml:space="preserve">Khách; chủ quán</w:t>
+            </w:r>
+          </w:p>
+        </w:tc>
+        <w:tc>
+          <w:tcPr>
+            <w:tcW w:type="dxa" w:w="3071"/>
+            <w:tcBorders>
+              <w:top w:val="single" w:color="A6A6A6" w:sz="4"/>
+              <w:left w:val="single" w:color="A6A6A6" w:sz="4"/>
+              <w:bottom w:val="single" w:color="A6A6A6" w:sz="4"/>
+              <w:right w:val="single" w:color="A6A6A6" w:sz="4"/>
+            </w:tcBorders>
+            <w:tcMar>
+              <w:top w:type="dxa" w:w="60"/>
+              <w:left w:type="dxa" w:w="90"/>
+              <w:bottom w:type="dxa" w:w="40"/>
+              <w:right w:type="dxa" w:w="90"/>
+            </w:tcMar>
+            <w:vAlign w:val="top"/>
+          </w:tcPr>
+          <w:p>
+            <w:pPr>
+              <w:spacing w:after="30"/>
+              <w:jc w:val="left"/>
+            </w:pPr>
+            <w:r>
+              <w:rPr>
+                <w:rFonts w:ascii="Times New Roman" w:cs="Times New Roman" w:eastAsia="Times New Roman" w:hAnsi="Times New Roman"/>
+                <w:sz w:val="22"/>
+                <w:szCs w:val="22"/>
+              </w:rPr>
+              <w:t xml:space="preserve">Quét QR bàn lấy quán và số bàn; tải ảnh QR thanh toán (JPG, PNG, WebP, tối đa 2 MB).</w:t>
+            </w:r>
+          </w:p>
+        </w:tc>
+      </w:tr>
+      <w:tr>
+        <w:trPr>
+          <w:cantSplit/>
+        </w:trPr>
+        <w:tc>
+          <w:tcPr>
+            <w:tcW w:type="dxa" w:w="1500"/>
+            <w:tcBorders>
+              <w:top w:val="single" w:color="A6A6A6" w:sz="4"/>
+              <w:left w:val="single" w:color="A6A6A6" w:sz="4"/>
+              <w:bottom w:val="single" w:color="A6A6A6" w:sz="4"/>
+              <w:right w:val="single" w:color="A6A6A6" w:sz="4"/>
+            </w:tcBorders>
+            <w:tcMar>
+              <w:top w:type="dxa" w:w="60"/>
+              <w:left w:type="dxa" w:w="90"/>
+              <w:bottom w:type="dxa" w:w="40"/>
+              <w:right w:type="dxa" w:w="90"/>
+            </w:tcMar>
+            <w:vAlign w:val="top"/>
+          </w:tcPr>
+          <w:p>
+            <w:pPr>
+              <w:spacing w:after="30"/>
+              <w:jc w:val="left"/>
+            </w:pPr>
+            <w:r>
+              <w:rPr>
+                <w:rFonts w:ascii="Times New Roman" w:cs="Times New Roman" w:eastAsia="Times New Roman" w:hAnsi="Times New Roman"/>
+                <w:sz w:val="22"/>
+                <w:szCs w:val="22"/>
+              </w:rPr>
+              <w:t xml:space="preserve">Đơn hàng</w:t>
+            </w:r>
+          </w:p>
+        </w:tc>
+        <w:tc>
+          <w:tcPr>
+            <w:tcW w:type="dxa" w:w="3000"/>
+            <w:tcBorders>
+              <w:top w:val="single" w:color="A6A6A6" w:sz="4"/>
+              <w:left w:val="single" w:color="A6A6A6" w:sz="4"/>
+              <w:bottom w:val="single" w:color="A6A6A6" w:sz="4"/>
+              <w:right w:val="single" w:color="A6A6A6" w:sz="4"/>
+            </w:tcBorders>
+            <w:tcMar>
+              <w:top w:type="dxa" w:w="60"/>
+              <w:left w:type="dxa" w:w="90"/>
+              <w:bottom w:type="dxa" w:w="40"/>
+              <w:right w:type="dxa" w:w="90"/>
+            </w:tcMar>
+            <w:vAlign w:val="top"/>
+          </w:tcPr>
+          <w:p>
+            <w:pPr>
+              <w:spacing w:after="30"/>
+              <w:jc w:val="left"/>
+            </w:pPr>
+            <w:r>
+              <w:rPr>
+                <w:rFonts w:ascii="Times New Roman" w:cs="Times New Roman" w:eastAsia="Times New Roman" w:hAnsi="Times New Roman"/>
+                <w:sz w:val="22"/>
+                <w:szCs w:val="22"/>
+              </w:rPr>
+              <w:t xml:space="preserve">POST /api/orders/quote; POST /api/orders; GET /api/orders/&lt;id&gt;; PUT /api/orders/&lt;id&gt;/cancel</w:t>
+            </w:r>
+          </w:p>
+        </w:tc>
+        <w:tc>
+          <w:tcPr>
+            <w:tcW w:type="dxa" w:w="1500"/>
+            <w:tcBorders>
+              <w:top w:val="single" w:color="A6A6A6" w:sz="4"/>
+              <w:left w:val="single" w:color="A6A6A6" w:sz="4"/>
+              <w:bottom w:val="single" w:color="A6A6A6" w:sz="4"/>
+              <w:right w:val="single" w:color="A6A6A6" w:sz="4"/>
+            </w:tcBorders>
+            <w:tcMar>
+              <w:top w:type="dxa" w:w="60"/>
+              <w:left w:type="dxa" w:w="90"/>
+              <w:bottom w:type="dxa" w:w="40"/>
+              <w:right w:type="dxa" w:w="90"/>
+            </w:tcMar>
+            <w:vAlign w:val="top"/>
+          </w:tcPr>
+          <w:p>
+            <w:pPr>
+              <w:spacing w:after="30"/>
+              <w:jc w:val="left"/>
+            </w:pPr>
+            <w:r>
+              <w:rPr>
+                <w:rFonts w:ascii="Times New Roman" w:cs="Times New Roman" w:eastAsia="Times New Roman" w:hAnsi="Times New Roman"/>
+                <w:sz w:val="22"/>
+                <w:szCs w:val="22"/>
+              </w:rPr>
+              <w:t xml:space="preserve">Khách</w:t>
+            </w:r>
+          </w:p>
+        </w:tc>
+        <w:tc>
+          <w:tcPr>
+            <w:tcW w:type="dxa" w:w="3071"/>
+            <w:tcBorders>
+              <w:top w:val="single" w:color="A6A6A6" w:sz="4"/>
+              <w:left w:val="single" w:color="A6A6A6" w:sz="4"/>
+              <w:bottom w:val="single" w:color="A6A6A6" w:sz="4"/>
+              <w:right w:val="single" w:color="A6A6A6" w:sz="4"/>
+            </w:tcBorders>
+            <w:tcMar>
+              <w:top w:type="dxa" w:w="60"/>
+              <w:left w:type="dxa" w:w="90"/>
+              <w:bottom w:type="dxa" w:w="40"/>
+              <w:right w:type="dxa" w:w="90"/>
+            </w:tcMar>
+            <w:vAlign w:val="top"/>
+          </w:tcPr>
+          <w:p>
+            <w:pPr>
+              <w:spacing w:after="30"/>
+              <w:jc w:val="left"/>
+            </w:pPr>
+            <w:r>
+              <w:rPr>
+                <w:rFonts w:ascii="Times New Roman" w:cs="Times New Roman" w:eastAsia="Times New Roman" w:hAnsi="Times New Roman"/>
+                <w:sz w:val="22"/>
+                <w:szCs w:val="22"/>
+              </w:rPr>
+              <w:t xml:space="preserve">Tính tạm, gửi đơn, xem đơn bằng mã riêng, hủy đơn khi còn chờ xác nhận.</w:t>
+            </w:r>
+          </w:p>
+        </w:tc>
+      </w:tr>
+      <w:tr>
+        <w:trPr>
+          <w:cantSplit/>
+        </w:trPr>
+        <w:tc>
+          <w:tcPr>
+            <w:tcW w:type="dxa" w:w="1500"/>
+            <w:tcBorders>
+              <w:top w:val="single" w:color="A6A6A6" w:sz="4"/>
+              <w:left w:val="single" w:color="A6A6A6" w:sz="4"/>
+              <w:bottom w:val="single" w:color="A6A6A6" w:sz="4"/>
+              <w:right w:val="single" w:color="A6A6A6" w:sz="4"/>
+            </w:tcBorders>
+            <w:tcMar>
+              <w:top w:type="dxa" w:w="60"/>
+              <w:left w:type="dxa" w:w="90"/>
+              <w:bottom w:type="dxa" w:w="40"/>
+              <w:right w:type="dxa" w:w="90"/>
+            </w:tcMar>
+            <w:vAlign w:val="top"/>
+          </w:tcPr>
+          <w:p>
+            <w:pPr>
+              <w:spacing w:after="30"/>
+              <w:jc w:val="left"/>
+            </w:pPr>
+            <w:r>
+              <w:rPr>
+                <w:rFonts w:ascii="Times New Roman" w:cs="Times New Roman" w:eastAsia="Times New Roman" w:hAnsi="Times New Roman"/>
+                <w:sz w:val="22"/>
+                <w:szCs w:val="22"/>
+              </w:rPr>
+              <w:t xml:space="preserve">Đơn hàng</w:t>
+            </w:r>
+          </w:p>
+        </w:tc>
+        <w:tc>
+          <w:tcPr>
+            <w:tcW w:type="dxa" w:w="3000"/>
+            <w:tcBorders>
+              <w:top w:val="single" w:color="A6A6A6" w:sz="4"/>
+              <w:left w:val="single" w:color="A6A6A6" w:sz="4"/>
+              <w:bottom w:val="single" w:color="A6A6A6" w:sz="4"/>
+              <w:right w:val="single" w:color="A6A6A6" w:sz="4"/>
+            </w:tcBorders>
+            <w:tcMar>
+              <w:top w:type="dxa" w:w="60"/>
+              <w:left w:type="dxa" w:w="90"/>
+              <w:bottom w:type="dxa" w:w="40"/>
+              <w:right w:type="dxa" w:w="90"/>
+            </w:tcMar>
+            <w:vAlign w:val="top"/>
+          </w:tcPr>
+          <w:p>
+            <w:pPr>
+              <w:spacing w:after="30"/>
+              <w:jc w:val="left"/>
+            </w:pPr>
+            <w:r>
+              <w:rPr>
+                <w:rFonts w:ascii="Times New Roman" w:cs="Times New Roman" w:eastAsia="Times New Roman" w:hAnsi="Times New Roman"/>
+                <w:sz w:val="22"/>
+                <w:szCs w:val="22"/>
+              </w:rPr>
+              <w:t xml:space="preserve">GET /api/orders; PUT /api/orders/&lt;id&gt;/status; PUT /api/orders/&lt;id&gt;/payment</w:t>
+            </w:r>
+          </w:p>
+        </w:tc>
+        <w:tc>
+          <w:tcPr>
+            <w:tcW w:type="dxa" w:w="1500"/>
+            <w:tcBorders>
+              <w:top w:val="single" w:color="A6A6A6" w:sz="4"/>
+              <w:left w:val="single" w:color="A6A6A6" w:sz="4"/>
+              <w:bottom w:val="single" w:color="A6A6A6" w:sz="4"/>
+              <w:right w:val="single" w:color="A6A6A6" w:sz="4"/>
+            </w:tcBorders>
+            <w:tcMar>
+              <w:top w:type="dxa" w:w="60"/>
+              <w:left w:type="dxa" w:w="90"/>
+              <w:bottom w:type="dxa" w:w="40"/>
+              <w:right w:type="dxa" w:w="90"/>
+            </w:tcMar>
+            <w:vAlign w:val="top"/>
+          </w:tcPr>
+          <w:p>
+            <w:pPr>
+              <w:spacing w:after="30"/>
+              <w:jc w:val="left"/>
+            </w:pPr>
+            <w:r>
+              <w:rPr>
+                <w:rFonts w:ascii="Times New Roman" w:cs="Times New Roman" w:eastAsia="Times New Roman" w:hAnsi="Times New Roman"/>
+                <w:sz w:val="22"/>
+                <w:szCs w:val="22"/>
+              </w:rPr>
+              <w:t xml:space="preserve">Chủ quán</w:t>
+            </w:r>
+          </w:p>
+        </w:tc>
+        <w:tc>
+          <w:tcPr>
+            <w:tcW w:type="dxa" w:w="3071"/>
+            <w:tcBorders>
+              <w:top w:val="single" w:color="A6A6A6" w:sz="4"/>
+              <w:left w:val="single" w:color="A6A6A6" w:sz="4"/>
+              <w:bottom w:val="single" w:color="A6A6A6" w:sz="4"/>
+              <w:right w:val="single" w:color="A6A6A6" w:sz="4"/>
+            </w:tcBorders>
+            <w:tcMar>
+              <w:top w:type="dxa" w:w="60"/>
+              <w:left w:type="dxa" w:w="90"/>
+              <w:bottom w:type="dxa" w:w="40"/>
+              <w:right w:type="dxa" w:w="90"/>
+            </w:tcMar>
+            <w:vAlign w:val="top"/>
+          </w:tcPr>
+          <w:p>
+            <w:pPr>
+              <w:spacing w:after="30"/>
+              <w:jc w:val="left"/>
+            </w:pPr>
+            <w:r>
+              <w:rPr>
+                <w:rFonts w:ascii="Times New Roman" w:cs="Times New Roman" w:eastAsia="Times New Roman" w:hAnsi="Times New Roman"/>
+                <w:sz w:val="22"/>
+                <w:szCs w:val="22"/>
+              </w:rPr>
+              <w:t xml:space="preserve">Danh sách đơn của quán (trang tự kiểm tra mỗi 7 giây), đổi trạng thái (hủy kèm lý do), đánh dấu thanh toán.</w:t>
+            </w:r>
+          </w:p>
+        </w:tc>
+      </w:tr>
+      <w:tr>
+        <w:trPr>
+          <w:cantSplit/>
+        </w:trPr>
+        <w:tc>
+          <w:tcPr>
+            <w:tcW w:type="dxa" w:w="1500"/>
+            <w:tcBorders>
+              <w:top w:val="single" w:color="A6A6A6" w:sz="4"/>
+              <w:left w:val="single" w:color="A6A6A6" w:sz="4"/>
+              <w:bottom w:val="single" w:color="A6A6A6" w:sz="4"/>
+              <w:right w:val="single" w:color="A6A6A6" w:sz="4"/>
+            </w:tcBorders>
+            <w:tcMar>
+              <w:top w:type="dxa" w:w="60"/>
+              <w:left w:type="dxa" w:w="90"/>
+              <w:bottom w:type="dxa" w:w="40"/>
+              <w:right w:type="dxa" w:w="90"/>
+            </w:tcMar>
+            <w:vAlign w:val="top"/>
+          </w:tcPr>
+          <w:p>
+            <w:pPr>
+              <w:spacing w:after="30"/>
+              <w:jc w:val="left"/>
+            </w:pPr>
+            <w:r>
+              <w:rPr>
+                <w:rFonts w:ascii="Times New Roman" w:cs="Times New Roman" w:eastAsia="Times New Roman" w:hAnsi="Times New Roman"/>
+                <w:sz w:val="22"/>
+                <w:szCs w:val="22"/>
+              </w:rPr>
+              <w:t xml:space="preserve">Mã giảm giá (Sprint 3)</w:t>
+            </w:r>
+          </w:p>
+        </w:tc>
+        <w:tc>
+          <w:tcPr>
+            <w:tcW w:type="dxa" w:w="3000"/>
+            <w:tcBorders>
+              <w:top w:val="single" w:color="A6A6A6" w:sz="4"/>
+              <w:left w:val="single" w:color="A6A6A6" w:sz="4"/>
+              <w:bottom w:val="single" w:color="A6A6A6" w:sz="4"/>
+              <w:right w:val="single" w:color="A6A6A6" w:sz="4"/>
+            </w:tcBorders>
+            <w:tcMar>
+              <w:top w:type="dxa" w:w="60"/>
+              <w:left w:type="dxa" w:w="90"/>
+              <w:bottom w:type="dxa" w:w="40"/>
+              <w:right w:type="dxa" w:w="90"/>
+            </w:tcMar>
+            <w:vAlign w:val="top"/>
+          </w:tcPr>
+          <w:p>
+            <w:pPr>
+              <w:spacing w:after="30"/>
+              <w:jc w:val="left"/>
+            </w:pPr>
+            <w:r>
+              <w:rPr>
+                <w:rFonts w:ascii="Times New Roman" w:cs="Times New Roman" w:eastAsia="Times New Roman" w:hAnsi="Times New Roman"/>
+                <w:sz w:val="22"/>
+                <w:szCs w:val="22"/>
+              </w:rPr>
+              <w:t xml:space="preserve">GET, POST /api/coupons; PUT, DELETE /api/coupons/&lt;id&gt;</w:t>
+            </w:r>
+          </w:p>
+        </w:tc>
+        <w:tc>
+          <w:tcPr>
+            <w:tcW w:type="dxa" w:w="1500"/>
+            <w:tcBorders>
+              <w:top w:val="single" w:color="A6A6A6" w:sz="4"/>
+              <w:left w:val="single" w:color="A6A6A6" w:sz="4"/>
+              <w:bottom w:val="single" w:color="A6A6A6" w:sz="4"/>
+              <w:right w:val="single" w:color="A6A6A6" w:sz="4"/>
+            </w:tcBorders>
+            <w:tcMar>
+              <w:top w:type="dxa" w:w="60"/>
+              <w:left w:type="dxa" w:w="90"/>
+              <w:bottom w:type="dxa" w:w="40"/>
+              <w:right w:type="dxa" w:w="90"/>
+            </w:tcMar>
+            <w:vAlign w:val="top"/>
+          </w:tcPr>
+          <w:p>
+            <w:pPr>
+              <w:spacing w:after="30"/>
+              <w:jc w:val="left"/>
+            </w:pPr>
+            <w:r>
+              <w:rPr>
+                <w:rFonts w:ascii="Times New Roman" w:cs="Times New Roman" w:eastAsia="Times New Roman" w:hAnsi="Times New Roman"/>
+                <w:sz w:val="22"/>
+                <w:szCs w:val="22"/>
+              </w:rPr>
+              <w:t xml:space="preserve">Chủ quán</w:t>
+            </w:r>
+          </w:p>
+        </w:tc>
+        <w:tc>
+          <w:tcPr>
+            <w:tcW w:type="dxa" w:w="3071"/>
+            <w:tcBorders>
+              <w:top w:val="single" w:color="A6A6A6" w:sz="4"/>
+              <w:left w:val="single" w:color="A6A6A6" w:sz="4"/>
+              <w:bottom w:val="single" w:color="A6A6A6" w:sz="4"/>
+              <w:right w:val="single" w:color="A6A6A6" w:sz="4"/>
+            </w:tcBorders>
+            <w:tcMar>
+              <w:top w:type="dxa" w:w="60"/>
+              <w:left w:type="dxa" w:w="90"/>
+              <w:bottom w:type="dxa" w:w="40"/>
+              <w:right w:type="dxa" w:w="90"/>
+            </w:tcMar>
+            <w:vAlign w:val="top"/>
+          </w:tcPr>
+          <w:p>
+            <w:pPr>
+              <w:spacing w:after="30"/>
+              <w:jc w:val="left"/>
+            </w:pPr>
+            <w:r>
+              <w:rPr>
+                <w:rFonts w:ascii="Times New Roman" w:cs="Times New Roman" w:eastAsia="Times New Roman" w:hAnsi="Times New Roman"/>
+                <w:sz w:val="22"/>
+                <w:szCs w:val="22"/>
+              </w:rPr>
+              <w:t xml:space="preserve">Tạo, sửa, bật hoặc tắt, xóa mã (giảm theo % hoặc số tiền, đơn tối thiểu, thời hạn, số lượt). Khách nhập mã khi gọi /api/orders/quote và /api/orders; hủy đơn thì trả lại lượt dùng.</w:t>
+            </w:r>
+          </w:p>
+        </w:tc>
+      </w:tr>
+      <w:tr>
+        <w:trPr>
+          <w:cantSplit/>
+        </w:trPr>
+        <w:tc>
+          <w:tcPr>
+            <w:tcW w:type="dxa" w:w="1500"/>
+            <w:tcBorders>
+              <w:top w:val="single" w:color="A6A6A6" w:sz="4"/>
+              <w:left w:val="single" w:color="A6A6A6" w:sz="4"/>
+              <w:bottom w:val="single" w:color="A6A6A6" w:sz="4"/>
+              <w:right w:val="single" w:color="A6A6A6" w:sz="4"/>
+            </w:tcBorders>
+            <w:tcMar>
+              <w:top w:type="dxa" w:w="60"/>
+              <w:left w:type="dxa" w:w="90"/>
+              <w:bottom w:type="dxa" w:w="40"/>
+              <w:right w:type="dxa" w:w="90"/>
+            </w:tcMar>
+            <w:vAlign w:val="top"/>
+          </w:tcPr>
+          <w:p>
+            <w:pPr>
+              <w:spacing w:after="30"/>
+              <w:jc w:val="left"/>
+            </w:pPr>
+            <w:r>
+              <w:rPr>
+                <w:rFonts w:ascii="Times New Roman" w:cs="Times New Roman" w:eastAsia="Times New Roman" w:hAnsi="Times New Roman"/>
+                <w:sz w:val="22"/>
+                <w:szCs w:val="22"/>
+              </w:rPr>
+              <w:t xml:space="preserve">Tính tiền theo bàn (Sprint 3)</w:t>
+            </w:r>
+          </w:p>
+        </w:tc>
+        <w:tc>
+          <w:tcPr>
+            <w:tcW w:type="dxa" w:w="3000"/>
+            <w:tcBorders>
+              <w:top w:val="single" w:color="A6A6A6" w:sz="4"/>
+              <w:left w:val="single" w:color="A6A6A6" w:sz="4"/>
+              <w:bottom w:val="single" w:color="A6A6A6" w:sz="4"/>
+              <w:right w:val="single" w:color="A6A6A6" w:sz="4"/>
+            </w:tcBorders>
+            <w:tcMar>
+              <w:top w:type="dxa" w:w="60"/>
+              <w:left w:type="dxa" w:w="90"/>
+              <w:bottom w:type="dxa" w:w="40"/>
+              <w:right w:type="dxa" w:w="90"/>
+            </w:tcMar>
+            <w:vAlign w:val="top"/>
+          </w:tcPr>
+          <w:p>
+            <w:pPr>
+              <w:spacing w:after="30"/>
+              <w:jc w:val="left"/>
+            </w:pPr>
+            <w:r>
+              <w:rPr>
+                <w:rFonts w:ascii="Times New Roman" w:cs="Times New Roman" w:eastAsia="Times New Roman" w:hAnsi="Times New Roman"/>
+                <w:sz w:val="22"/>
+                <w:szCs w:val="22"/>
+              </w:rPr>
+              <w:t xml:space="preserve">GET /api/shops/&lt;id&gt;/bills; POST /api/tables/&lt;id&gt;/settle</w:t>
+            </w:r>
+          </w:p>
+        </w:tc>
+        <w:tc>
+          <w:tcPr>
+            <w:tcW w:type="dxa" w:w="1500"/>
+            <w:tcBorders>
+              <w:top w:val="single" w:color="A6A6A6" w:sz="4"/>
+              <w:left w:val="single" w:color="A6A6A6" w:sz="4"/>
+              <w:bottom w:val="single" w:color="A6A6A6" w:sz="4"/>
+              <w:right w:val="single" w:color="A6A6A6" w:sz="4"/>
+            </w:tcBorders>
+            <w:tcMar>
+              <w:top w:type="dxa" w:w="60"/>
+              <w:left w:type="dxa" w:w="90"/>
+              <w:bottom w:type="dxa" w:w="40"/>
+              <w:right w:type="dxa" w:w="90"/>
+            </w:tcMar>
+            <w:vAlign w:val="top"/>
+          </w:tcPr>
+          <w:p>
+            <w:pPr>
+              <w:spacing w:after="30"/>
+              <w:jc w:val="left"/>
+            </w:pPr>
+            <w:r>
+              <w:rPr>
+                <w:rFonts w:ascii="Times New Roman" w:cs="Times New Roman" w:eastAsia="Times New Roman" w:hAnsi="Times New Roman"/>
+                <w:sz w:val="22"/>
+                <w:szCs w:val="22"/>
+              </w:rPr>
+              <w:t xml:space="preserve">Chủ quán</w:t>
+            </w:r>
+          </w:p>
+        </w:tc>
+        <w:tc>
+          <w:tcPr>
+            <w:tcW w:type="dxa" w:w="3071"/>
+            <w:tcBorders>
+              <w:top w:val="single" w:color="A6A6A6" w:sz="4"/>
+              <w:left w:val="single" w:color="A6A6A6" w:sz="4"/>
+              <w:bottom w:val="single" w:color="A6A6A6" w:sz="4"/>
+              <w:right w:val="single" w:color="A6A6A6" w:sz="4"/>
+            </w:tcBorders>
+            <w:tcMar>
+              <w:top w:type="dxa" w:w="60"/>
+              <w:left w:type="dxa" w:w="90"/>
+              <w:bottom w:type="dxa" w:w="40"/>
+              <w:right w:type="dxa" w:w="90"/>
+            </w:tcMar>
+            <w:vAlign w:val="top"/>
+          </w:tcPr>
+          <w:p>
+            <w:pPr>
+              <w:spacing w:after="30"/>
+              <w:jc w:val="left"/>
+            </w:pPr>
+            <w:r>
+              <w:rPr>
+                <w:rFonts w:ascii="Times New Roman" w:cs="Times New Roman" w:eastAsia="Times New Roman" w:hAnsi="Times New Roman"/>
+                <w:sz w:val="22"/>
+                <w:szCs w:val="22"/>
+              </w:rPr>
+              <w:t xml:space="preserve">Liệt kê bàn còn đơn chưa trả (không tính đơn đã hủy); thu tiền cả bàn hoặc từng đơn.</w:t>
+            </w:r>
+          </w:p>
+        </w:tc>
+      </w:tr>
+      <w:tr>
+        <w:trPr>
+          <w:cantSplit/>
+        </w:trPr>
+        <w:tc>
+          <w:tcPr>
+            <w:tcW w:type="dxa" w:w="1500"/>
+            <w:tcBorders>
+              <w:top w:val="single" w:color="A6A6A6" w:sz="4"/>
+              <w:left w:val="single" w:color="A6A6A6" w:sz="4"/>
+              <w:bottom w:val="single" w:color="A6A6A6" w:sz="4"/>
+              <w:right w:val="single" w:color="A6A6A6" w:sz="4"/>
+            </w:tcBorders>
+            <w:tcMar>
+              <w:top w:type="dxa" w:w="60"/>
+              <w:left w:type="dxa" w:w="90"/>
+              <w:bottom w:type="dxa" w:w="40"/>
+              <w:right w:type="dxa" w:w="90"/>
+            </w:tcMar>
+            <w:vAlign w:val="top"/>
+          </w:tcPr>
+          <w:p>
+            <w:pPr>
+              <w:spacing w:after="30"/>
+              <w:jc w:val="left"/>
+            </w:pPr>
+            <w:r>
+              <w:rPr>
+                <w:rFonts w:ascii="Times New Roman" w:cs="Times New Roman" w:eastAsia="Times New Roman" w:hAnsi="Times New Roman"/>
+                <w:sz w:val="22"/>
+                <w:szCs w:val="22"/>
+              </w:rPr>
+              <w:t xml:space="preserve">Đánh giá (Sprint 3)</w:t>
+            </w:r>
+          </w:p>
+        </w:tc>
+        <w:tc>
+          <w:tcPr>
+            <w:tcW w:type="dxa" w:w="3000"/>
+            <w:tcBorders>
+              <w:top w:val="single" w:color="A6A6A6" w:sz="4"/>
+              <w:left w:val="single" w:color="A6A6A6" w:sz="4"/>
+              <w:bottom w:val="single" w:color="A6A6A6" w:sz="4"/>
+              <w:right w:val="single" w:color="A6A6A6" w:sz="4"/>
+            </w:tcBorders>
+            <w:tcMar>
+              <w:top w:type="dxa" w:w="60"/>
+              <w:left w:type="dxa" w:w="90"/>
+              <w:bottom w:type="dxa" w:w="40"/>
+              <w:right w:type="dxa" w:w="90"/>
+            </w:tcMar>
+            <w:vAlign w:val="top"/>
+          </w:tcPr>
+          <w:p>
+            <w:pPr>
+              <w:spacing w:after="30"/>
+              <w:jc w:val="left"/>
+            </w:pPr>
+            <w:r>
+              <w:rPr>
+                <w:rFonts w:ascii="Times New Roman" w:cs="Times New Roman" w:eastAsia="Times New Roman" w:hAnsi="Times New Roman"/>
+                <w:sz w:val="22"/>
+                <w:szCs w:val="22"/>
+              </w:rPr>
+              <w:t xml:space="preserve">POST /api/orders/&lt;id&gt;/review; GET /api/reviews</w:t>
+            </w:r>
+          </w:p>
+        </w:tc>
+        <w:tc>
+          <w:tcPr>
+            <w:tcW w:type="dxa" w:w="1500"/>
+            <w:tcBorders>
+              <w:top w:val="single" w:color="A6A6A6" w:sz="4"/>
+              <w:left w:val="single" w:color="A6A6A6" w:sz="4"/>
+              <w:bottom w:val="single" w:color="A6A6A6" w:sz="4"/>
+              <w:right w:val="single" w:color="A6A6A6" w:sz="4"/>
+            </w:tcBorders>
+            <w:tcMar>
+              <w:top w:type="dxa" w:w="60"/>
+              <w:left w:type="dxa" w:w="90"/>
+              <w:bottom w:type="dxa" w:w="40"/>
+              <w:right w:type="dxa" w:w="90"/>
+            </w:tcMar>
+            <w:vAlign w:val="top"/>
+          </w:tcPr>
+          <w:p>
+            <w:pPr>
+              <w:spacing w:after="30"/>
+              <w:jc w:val="left"/>
+            </w:pPr>
+            <w:r>
+              <w:rPr>
+                <w:rFonts w:ascii="Times New Roman" w:cs="Times New Roman" w:eastAsia="Times New Roman" w:hAnsi="Times New Roman"/>
+                <w:sz w:val="22"/>
+                <w:szCs w:val="22"/>
+              </w:rPr>
+              <w:t xml:space="preserve">Khách; chủ quán</w:t>
+            </w:r>
+          </w:p>
+        </w:tc>
+        <w:tc>
+          <w:tcPr>
+            <w:tcW w:type="dxa" w:w="3071"/>
+            <w:tcBorders>
+              <w:top w:val="single" w:color="A6A6A6" w:sz="4"/>
+              <w:left w:val="single" w:color="A6A6A6" w:sz="4"/>
+              <w:bottom w:val="single" w:color="A6A6A6" w:sz="4"/>
+              <w:right w:val="single" w:color="A6A6A6" w:sz="4"/>
+            </w:tcBorders>
+            <w:tcMar>
+              <w:top w:type="dxa" w:w="60"/>
+              <w:left w:type="dxa" w:w="90"/>
+              <w:bottom w:type="dxa" w:w="40"/>
+              <w:right w:type="dxa" w:w="90"/>
+            </w:tcMar>
+            <w:vAlign w:val="top"/>
+          </w:tcPr>
+          <w:p>
+            <w:pPr>
+              <w:spacing w:after="30"/>
+              <w:jc w:val="left"/>
+            </w:pPr>
+            <w:r>
+              <w:rPr>
+                <w:rFonts w:ascii="Times New Roman" w:cs="Times New Roman" w:eastAsia="Times New Roman" w:hAnsi="Times New Roman"/>
+                <w:sz w:val="22"/>
+                <w:szCs w:val="22"/>
+              </w:rPr>
+              <w:t xml:space="preserve">Khách đánh giá đơn Hoàn thành một lần (điểm 1 đến 5, nhận xét, điểm từng món); chủ quán xem điểm trung bình, phân bố sao, lọc theo sao.</w:t>
+            </w:r>
+          </w:p>
+        </w:tc>
+      </w:tr>
+      <w:tr>
+        <w:trPr>
+          <w:cantSplit/>
+        </w:trPr>
+        <w:tc>
+          <w:tcPr>
+            <w:tcW w:type="dxa" w:w="1500"/>
+            <w:tcBorders>
+              <w:top w:val="single" w:color="A6A6A6" w:sz="4"/>
+              <w:left w:val="single" w:color="A6A6A6" w:sz="4"/>
+              <w:bottom w:val="single" w:color="A6A6A6" w:sz="4"/>
+              <w:right w:val="single" w:color="A6A6A6" w:sz="4"/>
+            </w:tcBorders>
+            <w:tcMar>
+              <w:top w:type="dxa" w:w="60"/>
+              <w:left w:type="dxa" w:w="90"/>
+              <w:bottom w:type="dxa" w:w="40"/>
+              <w:right w:type="dxa" w:w="90"/>
+            </w:tcMar>
+            <w:vAlign w:val="top"/>
+          </w:tcPr>
+          <w:p>
+            <w:pPr>
+              <w:spacing w:after="30"/>
+              <w:jc w:val="left"/>
+            </w:pPr>
+            <w:r>
+              <w:rPr>
+                <w:rFonts w:ascii="Times New Roman" w:cs="Times New Roman" w:eastAsia="Times New Roman" w:hAnsi="Times New Roman"/>
+                <w:sz w:val="22"/>
+                <w:szCs w:val="22"/>
+              </w:rPr>
+              <w:t xml:space="preserve">Doanh thu (Sprint 3)</w:t>
+            </w:r>
+          </w:p>
+        </w:tc>
+        <w:tc>
+          <w:tcPr>
+            <w:tcW w:type="dxa" w:w="3000"/>
+            <w:tcBorders>
+              <w:top w:val="single" w:color="A6A6A6" w:sz="4"/>
+              <w:left w:val="single" w:color="A6A6A6" w:sz="4"/>
+              <w:bottom w:val="single" w:color="A6A6A6" w:sz="4"/>
+              <w:right w:val="single" w:color="A6A6A6" w:sz="4"/>
+            </w:tcBorders>
+            <w:tcMar>
+              <w:top w:type="dxa" w:w="60"/>
+              <w:left w:type="dxa" w:w="90"/>
+              <w:bottom w:type="dxa" w:w="40"/>
+              <w:right w:type="dxa" w:w="90"/>
+            </w:tcMar>
+            <w:vAlign w:val="top"/>
+          </w:tcPr>
+          <w:p>
+            <w:pPr>
+              <w:spacing w:after="30"/>
+              <w:jc w:val="left"/>
+            </w:pPr>
+            <w:r>
+              <w:rPr>
+                <w:rFonts w:ascii="Times New Roman" w:cs="Times New Roman" w:eastAsia="Times New Roman" w:hAnsi="Times New Roman"/>
+                <w:sz w:val="22"/>
+                <w:szCs w:val="22"/>
+              </w:rPr>
+              <w:t xml:space="preserve">GET /api/revenue (range=today|7d|30d|month hoặc from, to; group=day|month)</w:t>
+            </w:r>
+          </w:p>
+        </w:tc>
+        <w:tc>
+          <w:tcPr>
+            <w:tcW w:type="dxa" w:w="1500"/>
+            <w:tcBorders>
+              <w:top w:val="single" w:color="A6A6A6" w:sz="4"/>
+              <w:left w:val="single" w:color="A6A6A6" w:sz="4"/>
+              <w:bottom w:val="single" w:color="A6A6A6" w:sz="4"/>
+              <w:right w:val="single" w:color="A6A6A6" w:sz="4"/>
+            </w:tcBorders>
+            <w:tcMar>
+              <w:top w:type="dxa" w:w="60"/>
+              <w:left w:type="dxa" w:w="90"/>
+              <w:bottom w:type="dxa" w:w="40"/>
+              <w:right w:type="dxa" w:w="90"/>
+            </w:tcMar>
+            <w:vAlign w:val="top"/>
+          </w:tcPr>
+          <w:p>
+            <w:pPr>
+              <w:spacing w:after="30"/>
+              <w:jc w:val="left"/>
+            </w:pPr>
+            <w:r>
+              <w:rPr>
+                <w:rFonts w:ascii="Times New Roman" w:cs="Times New Roman" w:eastAsia="Times New Roman" w:hAnsi="Times New Roman"/>
+                <w:sz w:val="22"/>
+                <w:szCs w:val="22"/>
+              </w:rPr>
+              <w:t xml:space="preserve">Chủ quán</w:t>
+            </w:r>
+          </w:p>
+        </w:tc>
+        <w:tc>
+          <w:tcPr>
+            <w:tcW w:type="dxa" w:w="3071"/>
+            <w:tcBorders>
+              <w:top w:val="single" w:color="A6A6A6" w:sz="4"/>
+              <w:left w:val="single" w:color="A6A6A6" w:sz="4"/>
+              <w:bottom w:val="single" w:color="A6A6A6" w:sz="4"/>
+              <w:right w:val="single" w:color="A6A6A6" w:sz="4"/>
+            </w:tcBorders>
+            <w:tcMar>
+              <w:top w:type="dxa" w:w="60"/>
+              <w:left w:type="dxa" w:w="90"/>
+              <w:bottom w:type="dxa" w:w="40"/>
+              <w:right w:type="dxa" w:w="90"/>
+            </w:tcMar>
+            <w:vAlign w:val="top"/>
+          </w:tcPr>
+          <w:p>
+            <w:pPr>
+              <w:spacing w:after="30"/>
+              <w:jc w:val="left"/>
+            </w:pPr>
+            <w:r>
+              <w:rPr>
+                <w:rFonts w:ascii="Times New Roman" w:cs="Times New Roman" w:eastAsia="Times New Roman" w:hAnsi="Times New Roman"/>
+                <w:sz w:val="22"/>
+                <w:szCs w:val="22"/>
+              </w:rPr>
+              <w:t xml:space="preserve">Doanh thu và món bán chạy; chỉ tính đơn Hoàn thành, theo giờ Việt Nam, dùng tổng sau giảm giá.</w:t>
+            </w:r>
+          </w:p>
+        </w:tc>
+      </w:tr>
+      <w:tr>
+        <w:trPr>
+          <w:cantSplit/>
+        </w:trPr>
+        <w:tc>
+          <w:tcPr>
+            <w:tcW w:type="dxa" w:w="1500"/>
+            <w:tcBorders>
+              <w:top w:val="single" w:color="A6A6A6" w:sz="4"/>
+              <w:left w:val="single" w:color="A6A6A6" w:sz="4"/>
+              <w:bottom w:val="single" w:color="A6A6A6" w:sz="4"/>
+              <w:right w:val="single" w:color="A6A6A6" w:sz="4"/>
+            </w:tcBorders>
+            <w:tcMar>
+              <w:top w:type="dxa" w:w="60"/>
+              <w:left w:type="dxa" w:w="90"/>
+              <w:bottom w:type="dxa" w:w="40"/>
+              <w:right w:type="dxa" w:w="90"/>
+            </w:tcMar>
+            <w:vAlign w:val="top"/>
+          </w:tcPr>
+          <w:p>
+            <w:pPr>
+              <w:spacing w:after="30"/>
+              <w:jc w:val="left"/>
+            </w:pPr>
+            <w:r>
+              <w:rPr>
+                <w:rFonts w:ascii="Times New Roman" w:cs="Times New Roman" w:eastAsia="Times New Roman" w:hAnsi="Times New Roman"/>
+                <w:sz w:val="22"/>
+                <w:szCs w:val="22"/>
+              </w:rPr>
+              <w:t xml:space="preserve">Lịch sử, đặt lại, gợi ý (Sprint 3)</w:t>
+            </w:r>
+          </w:p>
+        </w:tc>
+        <w:tc>
+          <w:tcPr>
+            <w:tcW w:type="dxa" w:w="3000"/>
+            <w:tcBorders>
+              <w:top w:val="single" w:color="A6A6A6" w:sz="4"/>
+              <w:left w:val="single" w:color="A6A6A6" w:sz="4"/>
+              <w:bottom w:val="single" w:color="A6A6A6" w:sz="4"/>
+              <w:right w:val="single" w:color="A6A6A6" w:sz="4"/>
+            </w:tcBorders>
+            <w:tcMar>
+              <w:top w:type="dxa" w:w="60"/>
+              <w:left w:type="dxa" w:w="90"/>
+              <w:bottom w:type="dxa" w:w="40"/>
+              <w:right w:type="dxa" w:w="90"/>
+            </w:tcMar>
+            <w:vAlign w:val="top"/>
+          </w:tcPr>
+          <w:p>
+            <w:pPr>
+              <w:spacing w:after="30"/>
+              <w:jc w:val="left"/>
+            </w:pPr>
+            <w:r>
+              <w:rPr>
+                <w:rFonts w:ascii="Times New Roman" w:cs="Times New Roman" w:eastAsia="Times New Roman" w:hAnsi="Times New Roman"/>
+                <w:sz w:val="22"/>
+                <w:szCs w:val="22"/>
+              </w:rPr>
+              <w:t xml:space="preserve">GET /api/my/orders; GET /api/my/orders/&lt;id&gt;; POST /api/my/orders/&lt;id&gt;/claim; POST /api/my/orders/&lt;id&gt;/reorder; GET /api/shops/&lt;id&gt;/suggestions</w:t>
+            </w:r>
+          </w:p>
+        </w:tc>
+        <w:tc>
+          <w:tcPr>
+            <w:tcW w:type="dxa" w:w="1500"/>
+            <w:tcBorders>
+              <w:top w:val="single" w:color="A6A6A6" w:sz="4"/>
+              <w:left w:val="single" w:color="A6A6A6" w:sz="4"/>
+              <w:bottom w:val="single" w:color="A6A6A6" w:sz="4"/>
+              <w:right w:val="single" w:color="A6A6A6" w:sz="4"/>
+            </w:tcBorders>
+            <w:tcMar>
+              <w:top w:type="dxa" w:w="60"/>
+              <w:left w:type="dxa" w:w="90"/>
+              <w:bottom w:type="dxa" w:w="40"/>
+              <w:right w:type="dxa" w:w="90"/>
+            </w:tcMar>
+            <w:vAlign w:val="top"/>
+          </w:tcPr>
+          <w:p>
+            <w:pPr>
+              <w:spacing w:after="30"/>
+              <w:jc w:val="left"/>
+            </w:pPr>
+            <w:r>
+              <w:rPr>
+                <w:rFonts w:ascii="Times New Roman" w:cs="Times New Roman" w:eastAsia="Times New Roman" w:hAnsi="Times New Roman"/>
+                <w:sz w:val="22"/>
+                <w:szCs w:val="22"/>
+              </w:rPr>
+              <w:t xml:space="preserve">Khách có tài khoản; gợi ý: mọi người</w:t>
+            </w:r>
+          </w:p>
+        </w:tc>
+        <w:tc>
+          <w:tcPr>
+            <w:tcW w:type="dxa" w:w="3071"/>
+            <w:tcBorders>
+              <w:top w:val="single" w:color="A6A6A6" w:sz="4"/>
+              <w:left w:val="single" w:color="A6A6A6" w:sz="4"/>
+              <w:bottom w:val="single" w:color="A6A6A6" w:sz="4"/>
+              <w:right w:val="single" w:color="A6A6A6" w:sz="4"/>
+            </w:tcBorders>
+            <w:tcMar>
+              <w:top w:type="dxa" w:w="60"/>
+              <w:left w:type="dxa" w:w="90"/>
+              <w:bottom w:type="dxa" w:w="40"/>
+              <w:right w:type="dxa" w:w="90"/>
+            </w:tcMar>
+            <w:vAlign w:val="top"/>
+          </w:tcPr>
+          <w:p>
+            <w:pPr>
+              <w:spacing w:after="30"/>
+              <w:jc w:val="left"/>
+            </w:pPr>
+            <w:r>
+              <w:rPr>
+                <w:rFonts w:ascii="Times New Roman" w:cs="Times New Roman" w:eastAsia="Times New Roman" w:hAnsi="Times New Roman"/>
+                <w:sz w:val="22"/>
+                <w:szCs w:val="22"/>
+              </w:rPr>
+              <w:t xml:space="preserve">Lịch sử đơn; lưu đơn đã đặt trước khi đăng nhập vào tài khoản (kiểm tra mã riêng, chỉ nhận đơn chưa thuộc tài khoản khác); đặt lại món (bỏ món đã hết, dùng giá hiện tại); gợi ý món bán chạy và món hay gọi.</w:t>
+            </w:r>
+          </w:p>
+        </w:tc>
+      </w:tr>
+      <w:tr>
+        <w:trPr>
+          <w:cantSplit/>
+        </w:trPr>
+        <w:tc>
+          <w:tcPr>
+            <w:tcW w:type="dxa" w:w="1500"/>
+            <w:tcBorders>
+              <w:top w:val="single" w:color="A6A6A6" w:sz="4"/>
+              <w:left w:val="single" w:color="A6A6A6" w:sz="4"/>
+              <w:bottom w:val="single" w:color="A6A6A6" w:sz="4"/>
+              <w:right w:val="single" w:color="A6A6A6" w:sz="4"/>
+            </w:tcBorders>
+            <w:tcMar>
+              <w:top w:type="dxa" w:w="60"/>
+              <w:left w:type="dxa" w:w="90"/>
+              <w:bottom w:type="dxa" w:w="40"/>
+              <w:right w:type="dxa" w:w="90"/>
+            </w:tcMar>
+            <w:vAlign w:val="top"/>
+          </w:tcPr>
+          <w:p>
+            <w:pPr>
+              <w:spacing w:after="30"/>
+              <w:jc w:val="left"/>
+            </w:pPr>
+            <w:r>
+              <w:rPr>
+                <w:rFonts w:ascii="Times New Roman" w:cs="Times New Roman" w:eastAsia="Times New Roman" w:hAnsi="Times New Roman"/>
+                <w:sz w:val="22"/>
+                <w:szCs w:val="22"/>
+              </w:rPr>
+              <w:t xml:space="preserve">Khiếu nại (Sprint 3)</w:t>
+            </w:r>
+          </w:p>
+        </w:tc>
+        <w:tc>
+          <w:tcPr>
+            <w:tcW w:type="dxa" w:w="3000"/>
+            <w:tcBorders>
+              <w:top w:val="single" w:color="A6A6A6" w:sz="4"/>
+              <w:left w:val="single" w:color="A6A6A6" w:sz="4"/>
+              <w:bottom w:val="single" w:color="A6A6A6" w:sz="4"/>
+              <w:right w:val="single" w:color="A6A6A6" w:sz="4"/>
+            </w:tcBorders>
+            <w:tcMar>
+              <w:top w:type="dxa" w:w="60"/>
+              <w:left w:type="dxa" w:w="90"/>
+              <w:bottom w:type="dxa" w:w="40"/>
+              <w:right w:type="dxa" w:w="90"/>
+            </w:tcMar>
+            <w:vAlign w:val="top"/>
+          </w:tcPr>
+          <w:p>
+            <w:pPr>
+              <w:spacing w:after="30"/>
+              <w:jc w:val="left"/>
+            </w:pPr>
+            <w:r>
+              <w:rPr>
+                <w:rFonts w:ascii="Times New Roman" w:cs="Times New Roman" w:eastAsia="Times New Roman" w:hAnsi="Times New Roman"/>
+                <w:sz w:val="22"/>
+                <w:szCs w:val="22"/>
+              </w:rPr>
+              <w:t xml:space="preserve">POST, GET /api/orders/&lt;id&gt;/complaints; GET /api/my/complaints</w:t>
+            </w:r>
+          </w:p>
+        </w:tc>
+        <w:tc>
+          <w:tcPr>
+            <w:tcW w:type="dxa" w:w="1500"/>
+            <w:tcBorders>
+              <w:top w:val="single" w:color="A6A6A6" w:sz="4"/>
+              <w:left w:val="single" w:color="A6A6A6" w:sz="4"/>
+              <w:bottom w:val="single" w:color="A6A6A6" w:sz="4"/>
+              <w:right w:val="single" w:color="A6A6A6" w:sz="4"/>
+            </w:tcBorders>
+            <w:tcMar>
+              <w:top w:type="dxa" w:w="60"/>
+              <w:left w:type="dxa" w:w="90"/>
+              <w:bottom w:type="dxa" w:w="40"/>
+              <w:right w:type="dxa" w:w="90"/>
+            </w:tcMar>
+            <w:vAlign w:val="top"/>
+          </w:tcPr>
+          <w:p>
+            <w:pPr>
+              <w:spacing w:after="30"/>
+              <w:jc w:val="left"/>
+            </w:pPr>
+            <w:r>
+              <w:rPr>
+                <w:rFonts w:ascii="Times New Roman" w:cs="Times New Roman" w:eastAsia="Times New Roman" w:hAnsi="Times New Roman"/>
+                <w:sz w:val="22"/>
+                <w:szCs w:val="22"/>
+              </w:rPr>
+              <w:t xml:space="preserve">Khách</w:t>
+            </w:r>
+          </w:p>
+        </w:tc>
+        <w:tc>
+          <w:tcPr>
+            <w:tcW w:type="dxa" w:w="3071"/>
+            <w:tcBorders>
+              <w:top w:val="single" w:color="A6A6A6" w:sz="4"/>
+              <w:left w:val="single" w:color="A6A6A6" w:sz="4"/>
+              <w:bottom w:val="single" w:color="A6A6A6" w:sz="4"/>
+              <w:right w:val="single" w:color="A6A6A6" w:sz="4"/>
+            </w:tcBorders>
+            <w:tcMar>
+              <w:top w:type="dxa" w:w="60"/>
+              <w:left w:type="dxa" w:w="90"/>
+              <w:bottom w:type="dxa" w:w="40"/>
+              <w:right w:type="dxa" w:w="90"/>
+            </w:tcMar>
+            <w:vAlign w:val="top"/>
+          </w:tcPr>
+          <w:p>
+            <w:pPr>
+              <w:spacing w:after="30"/>
+              <w:jc w:val="left"/>
+            </w:pPr>
+            <w:r>
+              <w:rPr>
+                <w:rFonts w:ascii="Times New Roman" w:cs="Times New Roman" w:eastAsia="Times New Roman" w:hAnsi="Times New Roman"/>
+                <w:sz w:val="22"/>
+                <w:szCs w:val="22"/>
+              </w:rPr>
+              <w:t xml:space="preserve">Gửi khiếu nại (10 đến 500 ký tự) cho đơn không còn ở trạng thái chờ xác nhận; xem phản hồi của quán.</w:t>
+            </w:r>
+          </w:p>
+        </w:tc>
+      </w:tr>
+      <w:tr>
+        <w:trPr>
+          <w:cantSplit/>
+        </w:trPr>
+        <w:tc>
+          <w:tcPr>
+            <w:tcW w:type="dxa" w:w="1500"/>
+            <w:tcBorders>
+              <w:top w:val="single" w:color="A6A6A6" w:sz="4"/>
+              <w:left w:val="single" w:color="A6A6A6" w:sz="4"/>
+              <w:bottom w:val="single" w:color="A6A6A6" w:sz="4"/>
+              <w:right w:val="single" w:color="A6A6A6" w:sz="4"/>
+            </w:tcBorders>
+            <w:tcMar>
+              <w:top w:type="dxa" w:w="60"/>
+              <w:left w:type="dxa" w:w="90"/>
+              <w:bottom w:type="dxa" w:w="40"/>
+              <w:right w:type="dxa" w:w="90"/>
+            </w:tcMar>
+            <w:vAlign w:val="top"/>
+          </w:tcPr>
+          <w:p>
+            <w:pPr>
+              <w:spacing w:after="30"/>
+              <w:jc w:val="left"/>
+            </w:pPr>
+            <w:r>
+              <w:rPr>
+                <w:rFonts w:ascii="Times New Roman" w:cs="Times New Roman" w:eastAsia="Times New Roman" w:hAnsi="Times New Roman"/>
+                <w:sz w:val="22"/>
+                <w:szCs w:val="22"/>
+              </w:rPr>
+              <w:t xml:space="preserve">Khiếu nại (Sprint 3)</w:t>
+            </w:r>
+          </w:p>
+        </w:tc>
+        <w:tc>
+          <w:tcPr>
+            <w:tcW w:type="dxa" w:w="3000"/>
+            <w:tcBorders>
+              <w:top w:val="single" w:color="A6A6A6" w:sz="4"/>
+              <w:left w:val="single" w:color="A6A6A6" w:sz="4"/>
+              <w:bottom w:val="single" w:color="A6A6A6" w:sz="4"/>
+              <w:right w:val="single" w:color="A6A6A6" w:sz="4"/>
+            </w:tcBorders>
+            <w:tcMar>
+              <w:top w:type="dxa" w:w="60"/>
+              <w:left w:type="dxa" w:w="90"/>
+              <w:bottom w:type="dxa" w:w="40"/>
+              <w:right w:type="dxa" w:w="90"/>
+            </w:tcMar>
+            <w:vAlign w:val="top"/>
+          </w:tcPr>
+          <w:p>
+            <w:pPr>
+              <w:spacing w:after="30"/>
+              <w:jc w:val="left"/>
+            </w:pPr>
+            <w:r>
+              <w:rPr>
+                <w:rFonts w:ascii="Times New Roman" w:cs="Times New Roman" w:eastAsia="Times New Roman" w:hAnsi="Times New Roman"/>
+                <w:sz w:val="22"/>
+                <w:szCs w:val="22"/>
+              </w:rPr>
+              <w:t xml:space="preserve">GET /api/merchant/complaints; PUT /api/merchant/complaints/&lt;id&gt;/reply; PUT /api/merchant/complaints/&lt;id&gt;/close</w:t>
+            </w:r>
+          </w:p>
+        </w:tc>
+        <w:tc>
+          <w:tcPr>
+            <w:tcW w:type="dxa" w:w="1500"/>
+            <w:tcBorders>
+              <w:top w:val="single" w:color="A6A6A6" w:sz="4"/>
+              <w:left w:val="single" w:color="A6A6A6" w:sz="4"/>
+              <w:bottom w:val="single" w:color="A6A6A6" w:sz="4"/>
+              <w:right w:val="single" w:color="A6A6A6" w:sz="4"/>
+            </w:tcBorders>
+            <w:tcMar>
+              <w:top w:type="dxa" w:w="60"/>
+              <w:left w:type="dxa" w:w="90"/>
+              <w:bottom w:type="dxa" w:w="40"/>
+              <w:right w:type="dxa" w:w="90"/>
+            </w:tcMar>
+            <w:vAlign w:val="top"/>
+          </w:tcPr>
+          <w:p>
+            <w:pPr>
+              <w:spacing w:after="30"/>
+              <w:jc w:val="left"/>
+            </w:pPr>
+            <w:r>
+              <w:rPr>
+                <w:rFonts w:ascii="Times New Roman" w:cs="Times New Roman" w:eastAsia="Times New Roman" w:hAnsi="Times New Roman"/>
+                <w:sz w:val="22"/>
+                <w:szCs w:val="22"/>
+              </w:rPr>
+              <w:t xml:space="preserve">Chủ quán</w:t>
+            </w:r>
+          </w:p>
+        </w:tc>
+        <w:tc>
+          <w:tcPr>
+            <w:tcW w:type="dxa" w:w="3071"/>
+            <w:tcBorders>
+              <w:top w:val="single" w:color="A6A6A6" w:sz="4"/>
+              <w:left w:val="single" w:color="A6A6A6" w:sz="4"/>
+              <w:bottom w:val="single" w:color="A6A6A6" w:sz="4"/>
+              <w:right w:val="single" w:color="A6A6A6" w:sz="4"/>
+            </w:tcBorders>
+            <w:tcMar>
+              <w:top w:type="dxa" w:w="60"/>
+              <w:left w:type="dxa" w:w="90"/>
+              <w:bottom w:type="dxa" w:w="40"/>
+              <w:right w:type="dxa" w:w="90"/>
+            </w:tcMar>
+            <w:vAlign w:val="top"/>
+          </w:tcPr>
+          <w:p>
+            <w:pPr>
+              <w:spacing w:after="30"/>
+              <w:jc w:val="left"/>
+            </w:pPr>
+            <w:r>
+              <w:rPr>
+                <w:rFonts w:ascii="Times New Roman" w:cs="Times New Roman" w:eastAsia="Times New Roman" w:hAnsi="Times New Roman"/>
+                <w:sz w:val="22"/>
+                <w:szCs w:val="22"/>
+              </w:rPr>
+              <w:t xml:space="preserve">Xem, lọc theo trạng thái, phản hồi, đóng khiếu nại thuộc quán mình (FR-55). Admin không can thiệp.</w:t>
+            </w:r>
+          </w:p>
+        </w:tc>
+      </w:tr>
+      <w:tr>
+        <w:trPr>
+          <w:cantSplit/>
+        </w:trPr>
+        <w:tc>
+          <w:tcPr>
+            <w:tcW w:type="dxa" w:w="1500"/>
+            <w:tcBorders>
+              <w:top w:val="single" w:color="A6A6A6" w:sz="4"/>
+              <w:left w:val="single" w:color="A6A6A6" w:sz="4"/>
+              <w:bottom w:val="single" w:color="A6A6A6" w:sz="4"/>
+              <w:right w:val="single" w:color="A6A6A6" w:sz="4"/>
+            </w:tcBorders>
+            <w:tcMar>
+              <w:top w:type="dxa" w:w="60"/>
+              <w:left w:type="dxa" w:w="90"/>
+              <w:bottom w:type="dxa" w:w="40"/>
+              <w:right w:type="dxa" w:w="90"/>
+            </w:tcMar>
+            <w:vAlign w:val="top"/>
+          </w:tcPr>
+          <w:p>
+            <w:pPr>
+              <w:spacing w:after="30"/>
+              <w:jc w:val="left"/>
+            </w:pPr>
+            <w:r>
+              <w:rPr>
+                <w:rFonts w:ascii="Times New Roman" w:cs="Times New Roman" w:eastAsia="Times New Roman" w:hAnsi="Times New Roman"/>
+                <w:sz w:val="22"/>
+                <w:szCs w:val="22"/>
+              </w:rPr>
+              <w:t xml:space="preserve">Quản trị (Sprint 3)</w:t>
+            </w:r>
+          </w:p>
+        </w:tc>
+        <w:tc>
+          <w:tcPr>
+            <w:tcW w:type="dxa" w:w="3000"/>
+            <w:tcBorders>
+              <w:top w:val="single" w:color="A6A6A6" w:sz="4"/>
+              <w:left w:val="single" w:color="A6A6A6" w:sz="4"/>
+              <w:bottom w:val="single" w:color="A6A6A6" w:sz="4"/>
+              <w:right w:val="single" w:color="A6A6A6" w:sz="4"/>
+            </w:tcBorders>
+            <w:tcMar>
+              <w:top w:type="dxa" w:w="60"/>
+              <w:left w:type="dxa" w:w="90"/>
+              <w:bottom w:type="dxa" w:w="40"/>
+              <w:right w:type="dxa" w:w="90"/>
+            </w:tcMar>
+            <w:vAlign w:val="top"/>
+          </w:tcPr>
+          <w:p>
+            <w:pPr>
+              <w:spacing w:after="30"/>
+              <w:jc w:val="left"/>
+            </w:pPr>
+            <w:r>
+              <w:rPr>
+                <w:rFonts w:ascii="Times New Roman" w:cs="Times New Roman" w:eastAsia="Times New Roman" w:hAnsi="Times New Roman"/>
+                <w:sz w:val="22"/>
+                <w:szCs w:val="22"/>
+              </w:rPr>
+              <w:t xml:space="preserve">GET /api/admin/users; PUT /api/admin/users/&lt;id&gt;/status; GET /api/admin/statistics</w:t>
+            </w:r>
+          </w:p>
+        </w:tc>
+        <w:tc>
+          <w:tcPr>
+            <w:tcW w:type="dxa" w:w="1500"/>
+            <w:tcBorders>
+              <w:top w:val="single" w:color="A6A6A6" w:sz="4"/>
+              <w:left w:val="single" w:color="A6A6A6" w:sz="4"/>
+              <w:bottom w:val="single" w:color="A6A6A6" w:sz="4"/>
+              <w:right w:val="single" w:color="A6A6A6" w:sz="4"/>
+            </w:tcBorders>
+            <w:tcMar>
+              <w:top w:type="dxa" w:w="60"/>
+              <w:left w:type="dxa" w:w="90"/>
+              <w:bottom w:type="dxa" w:w="40"/>
+              <w:right w:type="dxa" w:w="90"/>
+            </w:tcMar>
+            <w:vAlign w:val="top"/>
+          </w:tcPr>
+          <w:p>
+            <w:pPr>
+              <w:spacing w:after="30"/>
+              <w:jc w:val="left"/>
+            </w:pPr>
+            <w:r>
+              <w:rPr>
+                <w:rFonts w:ascii="Times New Roman" w:cs="Times New Roman" w:eastAsia="Times New Roman" w:hAnsi="Times New Roman"/>
+                <w:sz w:val="22"/>
+                <w:szCs w:val="22"/>
+              </w:rPr>
+              <w:t xml:space="preserve">Quản trị viên</w:t>
+            </w:r>
+          </w:p>
+        </w:tc>
+        <w:tc>
+          <w:tcPr>
+            <w:tcW w:type="dxa" w:w="3071"/>
+            <w:tcBorders>
+              <w:top w:val="single" w:color="A6A6A6" w:sz="4"/>
+              <w:left w:val="single" w:color="A6A6A6" w:sz="4"/>
+              <w:bottom w:val="single" w:color="A6A6A6" w:sz="4"/>
+              <w:right w:val="single" w:color="A6A6A6" w:sz="4"/>
+            </w:tcBorders>
+            <w:tcMar>
+              <w:top w:type="dxa" w:w="60"/>
+              <w:left w:type="dxa" w:w="90"/>
+              <w:bottom w:type="dxa" w:w="40"/>
+              <w:right w:type="dxa" w:w="90"/>
+            </w:tcMar>
+            <w:vAlign w:val="top"/>
+          </w:tcPr>
+          <w:p>
+            <w:pPr>
+              <w:spacing w:after="30"/>
+              <w:jc w:val="left"/>
+            </w:pPr>
+            <w:r>
+              <w:rPr>
+                <w:rFonts w:ascii="Times New Roman" w:cs="Times New Roman" w:eastAsia="Times New Roman" w:hAnsi="Times New Roman"/>
+                <w:sz w:val="22"/>
+                <w:szCs w:val="22"/>
+              </w:rPr>
+              <w:t xml:space="preserve">Tìm, lọc, khóa hoặc mở khóa người dùng (không tự khóa mình); thống kê toàn hệ thống: số quán, người dùng, đơn, doanh thu (đơn Hoàn thành).</w:t>
+            </w:r>
+          </w:p>
+        </w:tc>
+      </w:tr>
+    </w:tbl>
+    <w:p>
+      <w:pPr>
+        <w:spacing w:after="120" w:before="0" w:line="300"/>
+        <w:jc w:val="both"/>
+      </w:pPr>
+      <w:r>
+        <w:rPr>
+          <w:rFonts w:ascii="Times New Roman" w:cs="Times New Roman" w:eastAsia="Times New Roman" w:hAnsi="Times New Roman"/>
+          <w:sz w:val="26"/>
+          <w:szCs w:val="26"/>
+        </w:rPr>
+      </w:r>
+    </w:p>
+    <w:p>
+      <w:pPr>
+        <w:pStyle w:val="Heading2"/>
+      </w:pPr>
+      <w:r>
+        <w:rPr>
+          <w:rFonts w:ascii="Times New Roman" w:cs="Times New Roman" w:eastAsia="Times New Roman" w:hAnsi="Times New Roman"/>
+        </w:rPr>
+        <w:t>9.3. Còn lại ngoài kế hoạch</w:t>
+      </w:r>
+    </w:p>
+    <w:p>
+      <w:pPr>
+        <w:pStyle w:val="ListParagraph"/>
+        <w:numPr>
+          <w:ilvl w:val="0"/>
+          <w:numId w:val="2"/>
+        </w:numPr>
+        <w:spacing w:after="80" w:line="288"/>
+        <w:jc w:val="left"/>
+      </w:pPr>
+      <w:r>
+        <w:rPr>
+          <w:rFonts w:ascii="Times New Roman" w:cs="Times New Roman" w:eastAsia="Times New Roman" w:hAnsi="Times New Roman"/>
+          <w:sz w:val="26"/>
+          <w:szCs w:val="26"/>
+        </w:rPr>
+        <w:t>FR-27 Thanh toán trực tuyến qua cổng thanh toán (nhóm Mở rộng) chưa triển khai; hiện thanh toán bằng tiền mặt hoặc chuyển khoản/QR do chủ quán xác nhận.</w:t>
+      </w:r>
+    </w:p>
+    <w:p>
+      <w:pPr>
+        <w:pStyle w:val="ListParagraph"/>
+        <w:numPr>
+          <w:ilvl w:val="0"/>
+          <w:numId w:val="2"/>
+        </w:numPr>
+        <w:spacing w:after="80" w:line="288"/>
+        <w:jc w:val="left"/>
+      </w:pPr>
+      <w:r>
+        <w:rPr>
+          <w:rFonts w:ascii="Times New Roman" w:cs="Times New Roman" w:eastAsia="Times New Roman" w:hAnsi="Times New Roman"/>
+          <w:sz w:val="26"/>
+          <w:szCs w:val="26"/>
+        </w:rPr>
+        <w:t>Các route Jinja2 ở mục 3 không được dùng trong bản cài đặt; giữ lại làm tài liệu thiết kế.</w:t>
+      </w:r>
+    </w:p>
     <w:sectPr>
       <w:headerReference w:type="default" r:id="rId7"/>
       <w:footerReference w:type="default" r:id="rId8"/>
@@ -48600,7 +50950,7 @@
         <w:sz w:val="20"/>
         <w:szCs w:val="20"/>
       </w:rPr>
-      <w:t xml:space="preserve">QuickOrder – Tài liệu Route/API v1.0   |   Trang </w:t>
+      <w:t xml:space="preserve">QuickOrder – Tài liệu Route/API v1.1   |   Trang </w:t>
     </w:r>
     <w:r>
       <w:rPr>
@@ -48614,6 +50964,16 @@
       <w:fldChar w:fldCharType="separate"/>
       <w:fldChar w:fldCharType="end"/>
     </w:r>
+  </w:p>
+</w:ftr>
+</file>
+
+<file path=word/footer2.xml><?xml version="1.0" encoding="utf-8"?>
+<w:ftr xmlns:m="http://schemas.openxmlformats.org/officeDocument/2006/math" xmlns:mc="http://schemas.openxmlformats.org/markup-compatibility/2006" xmlns:mo="http://schemas.microsoft.com/office/mac/office/2008/main" xmlns:mv="urn:schemas-microsoft-com:mac:vml" xmlns:o="urn:schemas-microsoft-com:office:office" xmlns:r="http://schemas.openxmlformats.org/officeDocument/2006/relationships" xmlns:v="urn:schemas-microsoft-com:vml" xmlns:w10="urn:schemas-microsoft-com:office:word" xmlns:w14="http://schemas.microsoft.com/office/word/2010/wordml" xmlns:w="http://schemas.openxmlformats.org/wordprocessingml/2006/main" xmlns:wne="http://schemas.microsoft.com/office/word/2006/wordml" xmlns:wp14="http://schemas.microsoft.com/office/word/2010/wordprocessingDrawing" xmlns:wp="http://schemas.openxmlformats.org/drawingml/2006/wordprocessingDrawing" xmlns:wpc="http://schemas.microsoft.com/office/word/2010/wordprocessingCanvas" xmlns:wpg="http://schemas.microsoft.com/office/word/2010/wordprocessingGroup" xmlns:wpi="http://schemas.microsoft.com/office/word/2010/wordprocessingInk" xmlns:wps="http://schemas.microsoft.com/office/word/2010/wordprocessingShape" mc:Ignorable="w14 wp14">
+  <w:p>
+    <w:pPr>
+      <w:pStyle w:val="Footer"/>
+    </w:pPr>
   </w:p>
 </w:ftr>
 </file>

</xml_diff>